<commit_message>
F23: referencias al notebook en el informe, nota de V de Cramér, outliers IQR/MAD, Deck_combinado y MAR; notebook reejecutado
</commit_message>
<xml_diff>
--- a/MCDI503/docs/mcdi503_f23_sumativo_grupo5.docx
+++ b/MCDI503/docs/mcdi503_f23_sumativo_grupo5.docx
@@ -1,6 +1,6 @@
 
 <file path=word/document.xml><?xml version="1.0" encoding="utf-8"?>
-<w:document xmlns:wpc="http://schemas.microsoft.com/office/word/2010/wordprocessingCanvas" xmlns:cx="http://schemas.microsoft.com/office/drawing/2014/chartex" xmlns:cx1="http://schemas.microsoft.com/office/drawing/2015/9/8/chartex" xmlns:cx2="http://schemas.microsoft.com/office/drawing/2015/10/21/chartex" xmlns:cx3="http://schemas.microsoft.com/office/drawing/2016/5/9/chartex" xmlns:cx4="http://schemas.microsoft.com/office/drawing/2016/5/10/chartex" xmlns:cx5="http://schemas.microsoft.com/office/drawing/2016/5/11/chartex" xmlns:cx6="http://schemas.microsoft.com/office/drawing/2016/5/12/chartex" xmlns:cx7="http://schemas.microsoft.com/office/drawing/2016/5/13/chartex" xmlns:cx8="http://schemas.microsoft.com/office/drawing/2016/5/14/chartex" xmlns:mc="http://schemas.openxmlformats.org/markup-compatibility/2006" xmlns:aink="http://schemas.microsoft.com/office/drawing/2016/ink" xmlns:am3d="http://schemas.microsoft.com/office/drawing/2017/model3d" xmlns:o="urn:schemas-microsoft-com:office:office" xmlns:oel="http://schemas.microsoft.com/office/2019/extlst" xmlns:r="http://schemas.openxmlformats.org/officeDocument/2006/relationships" xmlns:m="http://schemas.openxmlformats.org/officeDocument/2006/math" xmlns:v="urn:schemas-microsoft-com:vml" xmlns:wp14="http://schemas.microsoft.com/office/word/2010/wordprocessingDrawing" xmlns:wp="http://schemas.openxmlformats.org/drawingml/2006/wordprocessingDrawing" xmlns:w10="urn:schemas-microsoft-com:office:word" xmlns:w="http://schemas.openxmlformats.org/wordprocessingml/2006/main" xmlns:w14="http://schemas.microsoft.com/office/word/2010/wordml" xmlns:w15="http://schemas.microsoft.com/office/word/2012/wordml" xmlns:w16cex="http://schemas.microsoft.com/office/word/2018/wordml/cex" xmlns:w16cid="http://schemas.microsoft.com/office/word/2016/wordml/cid" xmlns:w16="http://schemas.microsoft.com/office/word/2018/wordml" xmlns:w16du="http://schemas.microsoft.com/office/word/2023/wordml/word16du" xmlns:w16sdtdh="http://schemas.microsoft.com/office/word/2020/wordml/sdtdatahash" xmlns:w16sdtfl="http://schemas.microsoft.com/office/word/2024/wordml/sdtformatlock" xmlns:w16se="http://schemas.microsoft.com/office/word/2015/wordml/symex" xmlns:wpg="http://schemas.microsoft.com/office/word/2010/wordprocessingGroup" xmlns:wpi="http://schemas.microsoft.com/office/word/2010/wordprocessingInk" xmlns:wne="http://schemas.microsoft.com/office/word/2006/wordml" xmlns:wps="http://schemas.microsoft.com/office/word/2010/wordprocessingShape" mc:Ignorable="w14 w15 w16se w16cid w16 w16cex w16sdtdh w16sdtfl w16du wp14">
+<w:document xmlns:wpc="http://schemas.microsoft.com/office/word/2010/wordprocessingCanvas" xmlns:cx="http://schemas.microsoft.com/office/drawing/2014/chartex" xmlns:cx1="http://schemas.microsoft.com/office/drawing/2015/9/8/chartex" xmlns:cx2="http://schemas.microsoft.com/office/drawing/2015/10/21/chartex" xmlns:cx3="http://schemas.microsoft.com/office/drawing/2016/5/9/chartex" xmlns:cx4="http://schemas.microsoft.com/office/drawing/2016/5/10/chartex" xmlns:cx5="http://schemas.microsoft.com/office/drawing/2016/5/11/chartex" xmlns:cx6="http://schemas.microsoft.com/office/drawing/2016/5/12/chartex" xmlns:cx7="http://schemas.microsoft.com/office/drawing/2016/5/13/chartex" xmlns:cx8="http://schemas.microsoft.com/office/drawing/2016/5/14/chartex" xmlns:mc="http://schemas.openxmlformats.org/markup-compatibility/2006" xmlns:aink="http://schemas.microsoft.com/office/drawing/2016/ink" xmlns:am3d="http://schemas.microsoft.com/office/drawing/2017/model3d" xmlns:o="urn:schemas-microsoft-com:office:office" xmlns:oel="http://schemas.microsoft.com/office/2019/extlst" xmlns:r="http://schemas.openxmlformats.org/officeDocument/2006/relationships" xmlns:m="http://schemas.openxmlformats.org/officeDocument/2006/math" xmlns:v="urn:schemas-microsoft-com:vml" xmlns:wp14="http://schemas.microsoft.com/office/word/2010/wordprocessingDrawing" xmlns:wp="http://schemas.openxmlformats.org/drawingml/2006/wordprocessingDrawing" xmlns:w10="urn:schemas-microsoft-com:office:word" xmlns:w="http://schemas.openxmlformats.org/wordprocessingml/2006/main" xmlns:w14="http://schemas.microsoft.com/office/word/2010/wordml" xmlns:w15="http://schemas.microsoft.com/office/word/2012/wordml" xmlns:w16cei="http://schemas.microsoft.com/office/word/2026/wordml/cei" xmlns:w16cex="http://schemas.microsoft.com/office/word/2018/wordml/cex" xmlns:w16cid="http://schemas.microsoft.com/office/word/2016/wordml/cid" xmlns:w16="http://schemas.microsoft.com/office/word/2018/wordml" xmlns:w16du="http://schemas.microsoft.com/office/word/2023/wordml/word16du" xmlns:w16sdtdh="http://schemas.microsoft.com/office/word/2020/wordml/sdtdatahash" xmlns:w16sdtfl="http://schemas.microsoft.com/office/word/2024/wordml/sdtformatlock" xmlns:w16se="http://schemas.microsoft.com/office/word/2015/wordml/symex" xmlns:wpg="http://schemas.microsoft.com/office/word/2010/wordprocessingGroup" xmlns:wpi="http://schemas.microsoft.com/office/word/2010/wordprocessingInk" xmlns:wne="http://schemas.microsoft.com/office/word/2006/wordml" xmlns:wps="http://schemas.microsoft.com/office/word/2010/wordprocessingShape" mc:Ignorable="w14 w15 w16se w16cid w16 w16cex w16sdtdh w16sdtfl w16du wp14">
   <w:body>
     <w:p>
       <w:pPr>
@@ -14,7 +14,7 @@
           <w:sz w:val="24"/>
           <w:lang w:val="es-CL"/>
         </w:rPr>
-        <w:t>MCDIA503</w:t>
+        <w:t>MCDI503</w:t>
       </w:r>
     </w:p>
     <w:p>
@@ -46,61 +46,7 @@
           <w:sz w:val="36"/>
           <w:lang w:val="es-CL"/>
         </w:rPr>
-        <w:t xml:space="preserve">Diagnóstico, limpieza, integración y análisis exploratorio </w:t>
-      </w:r>
-      <w:proofErr w:type="spellStart"/>
-      <w:r>
-        <w:rPr>
-          <w:b/>
-          <w:sz w:val="36"/>
-          <w:lang w:val="es-CL"/>
-        </w:rPr>
-        <w:t>univariado</w:t>
-      </w:r>
-      <w:proofErr w:type="spellEnd"/>
-      <w:r>
-        <w:rPr>
-          <w:b/>
-          <w:sz w:val="36"/>
-          <w:lang w:val="es-CL"/>
-        </w:rPr>
-        <w:t xml:space="preserve">-bivariado del </w:t>
-      </w:r>
-      <w:proofErr w:type="spellStart"/>
-      <w:r>
-        <w:rPr>
-          <w:b/>
-          <w:sz w:val="36"/>
-          <w:lang w:val="es-CL"/>
-        </w:rPr>
-        <w:t>dataset</w:t>
-      </w:r>
-      <w:proofErr w:type="spellEnd"/>
-      <w:r>
-        <w:rPr>
-          <w:b/>
-          <w:sz w:val="36"/>
-          <w:lang w:val="es-CL"/>
-        </w:rPr>
-        <w:t xml:space="preserve"> </w:t>
-      </w:r>
-      <w:proofErr w:type="spellStart"/>
-      <w:r>
-        <w:rPr>
-          <w:b/>
-          <w:sz w:val="36"/>
-          <w:lang w:val="es-CL"/>
-        </w:rPr>
-        <w:t>Titanic</w:t>
-      </w:r>
-      <w:proofErr w:type="spellEnd"/>
-      <w:r>
-        <w:rPr>
-          <w:b/>
-          <w:sz w:val="36"/>
-          <w:lang w:val="es-CL"/>
-        </w:rPr>
-        <w:t xml:space="preserve"> — Avance del Proyecto, Fases 2 y 3</w:t>
+        <w:t>Diagnóstico, limpieza, integración y análisis exploratorio univariado-bivariado del dataset Titanic — Avance del Proyecto, Fases 2 y 3</w:t>
       </w:r>
     </w:p>
     <w:tbl>
@@ -118,7 +64,6 @@
             <w:tcW w:w="2381" w:type="dxa"/>
           </w:tcPr>
           <w:p>
-            <w:proofErr w:type="spellStart"/>
             <w:r>
               <w:rPr>
                 <w:b/>
@@ -126,7 +71,6 @@
               </w:rPr>
               <w:t>Curso</w:t>
             </w:r>
-            <w:proofErr w:type="spellEnd"/>
           </w:p>
         </w:tc>
         <w:tc>
@@ -184,12 +128,61 @@
             <w:tcW w:w="2381" w:type="dxa"/>
           </w:tcPr>
           <w:p>
+            <w:pPr>
+              <w:rPr>
+                <w:b/>
+                <w:sz w:val="20"/>
+              </w:rPr>
+            </w:pPr>
             <w:r>
               <w:rPr>
                 <w:b/>
                 <w:sz w:val="20"/>
               </w:rPr>
               <w:t>Integrantes</w:t>
+            </w:r>
+          </w:p>
+          <w:p/>
+        </w:tc>
+        <w:tc>
+          <w:tcPr>
+            <w:tcW w:w="6690" w:type="dxa"/>
+          </w:tcPr>
+          <w:p>
+            <w:pPr>
+              <w:rPr>
+                <w:sz w:val="20"/>
+                <w:lang w:val="es-CL"/>
+              </w:rPr>
+            </w:pPr>
+            <w:r>
+              <w:rPr>
+                <w:sz w:val="20"/>
+                <w:lang w:val="es-CL"/>
+              </w:rPr>
+              <w:t>Arturo Knopke Vera, Nicolás Soletic Cobos, Sebastián Navarrete Soto, Roberto Moncada González</w:t>
+            </w:r>
+          </w:p>
+        </w:tc>
+      </w:tr>
+      <w:tr>
+        <w:tc>
+          <w:tcPr>
+            <w:tcW w:w="2381" w:type="dxa"/>
+          </w:tcPr>
+          <w:p>
+            <w:pPr>
+              <w:rPr>
+                <w:b/>
+                <w:sz w:val="20"/>
+              </w:rPr>
+            </w:pPr>
+            <w:r>
+              <w:rPr>
+                <w:b/>
+                <w:sz w:val="20"/>
+              </w:rPr>
+              <w:t>Docente</w:t>
             </w:r>
           </w:p>
         </w:tc>
@@ -200,6 +193,7 @@
           <w:p>
             <w:pPr>
               <w:rPr>
+                <w:sz w:val="20"/>
                 <w:lang w:val="es-CL"/>
               </w:rPr>
             </w:pPr>
@@ -208,7 +202,7 @@
                 <w:sz w:val="20"/>
                 <w:lang w:val="es-CL"/>
               </w:rPr>
-              <w:t>Arturo Knopke Vera, Nicolás Soletic Cobos, Sebastián Navarrete Soto, Roberto Moncada González</w:t>
+              <w:t>Sergio Paraíso Medina</w:t>
             </w:r>
           </w:p>
         </w:tc>
@@ -324,21 +318,7 @@
         <w:rPr>
           <w:lang w:val="es-CL"/>
         </w:rPr>
-        <w:t xml:space="preserve"> este informe sintetiza el trabajo técnico documentado en el </w:t>
-      </w:r>
-      <w:proofErr w:type="spellStart"/>
-      <w:r>
-        <w:rPr>
-          <w:lang w:val="es-CL"/>
-        </w:rPr>
-        <w:t>Jupyter</w:t>
-      </w:r>
-      <w:proofErr w:type="spellEnd"/>
-      <w:r>
-        <w:rPr>
-          <w:lang w:val="es-CL"/>
-        </w:rPr>
-        <w:t xml:space="preserve"> Notebook </w:t>
+        <w:t xml:space="preserve"> este informe sintetiza el trabajo técnico documentado en el Jupyter Notebook </w:t>
       </w:r>
       <w:r>
         <w:rPr>
@@ -351,35 +331,7 @@
         <w:rPr>
           <w:lang w:val="es-CL"/>
         </w:rPr>
-        <w:t xml:space="preserve">, que constituye la evidencia principal del proceso. El foco de análisis es la identificación de los factores asociados a la supervivencia de los pasajeros del RMS </w:t>
-      </w:r>
-      <w:proofErr w:type="spellStart"/>
-      <w:r>
-        <w:rPr>
-          <w:lang w:val="es-CL"/>
-        </w:rPr>
-        <w:t>Titanic</w:t>
-      </w:r>
-      <w:proofErr w:type="spellEnd"/>
-      <w:r>
-        <w:rPr>
-          <w:lang w:val="es-CL"/>
-        </w:rPr>
-        <w:t xml:space="preserve">, a partir de un </w:t>
-      </w:r>
-      <w:proofErr w:type="spellStart"/>
-      <w:r>
-        <w:rPr>
-          <w:lang w:val="es-CL"/>
-        </w:rPr>
-        <w:t>dataset</w:t>
-      </w:r>
-      <w:proofErr w:type="spellEnd"/>
-      <w:r>
-        <w:rPr>
-          <w:lang w:val="es-CL"/>
-        </w:rPr>
-        <w:t xml:space="preserve"> preparado de forma trazable y reproducible.</w:t>
+        <w:t>, que constituye la evidencia principal del proceso. El foco de análisis es la identificación de los factores asociados a la supervivencia de los pasajeros del RMS Titanic, a partir de un dataset preparado de forma trazable y reproducible.</w:t>
       </w:r>
     </w:p>
     <w:p>
@@ -410,21 +362,7 @@
         <w:rPr>
           <w:lang w:val="es-CL"/>
         </w:rPr>
-        <w:t xml:space="preserve">El hundimiento del RMS </w:t>
-      </w:r>
-      <w:proofErr w:type="spellStart"/>
-      <w:r>
-        <w:rPr>
-          <w:lang w:val="es-CL"/>
-        </w:rPr>
-        <w:t>Titanic</w:t>
-      </w:r>
-      <w:proofErr w:type="spellEnd"/>
-      <w:r>
-        <w:rPr>
-          <w:lang w:val="es-CL"/>
-        </w:rPr>
-        <w:t xml:space="preserve"> (15 de abril de 1912) es uno de los naufragios más documentados de la historia moderna. Si bien la supervivencia tuvo un componente de azar, existe evidencia histórica de que factores como el sexo, la clase de pasaje y la edad influyeron en la probabilidad de sobrevivir. El proyecto busca caracterizar estos factores mediante un análisis exploratorio estadísticamente riguroso, como base para un eventual modelado predictivo en fases posteriores.</w:t>
+        <w:t>El hundimiento del RMS Titanic (15 de abril de 1912) es uno de los naufragios más documentados de la historia moderna. Si bien la supervivencia tuvo un componente de azar, existe evidencia histórica de que factores como el sexo, la clase de pasaje y la edad influyeron en la probabilidad de sobrevivir. El proyecto busca caracterizar estos factores mediante un análisis exploratorio estadísticamente riguroso, como base para un eventual modelado predictivo en fases posteriores.</w:t>
       </w:r>
     </w:p>
     <w:p>
@@ -458,243 +396,79 @@
         <w:rPr>
           <w:lang w:val="es-CL"/>
         </w:rPr>
-        <w:t xml:space="preserve"> (</w:t>
-      </w:r>
-      <w:proofErr w:type="spellStart"/>
-      <w:r>
-        <w:rPr>
-          <w:lang w:val="es-CL"/>
-        </w:rPr>
-        <w:t>Kaggle</w:t>
-      </w:r>
-      <w:proofErr w:type="spellEnd"/>
-      <w:r>
-        <w:rPr>
-          <w:lang w:val="es-CL"/>
-        </w:rPr>
-        <w:t xml:space="preserve">, </w:t>
-      </w:r>
-      <w:proofErr w:type="spellStart"/>
+        <w:t xml:space="preserve"> (Kaggle, </w:t>
+      </w:r>
       <w:r>
         <w:rPr>
           <w:i/>
           <w:lang w:val="es-CL"/>
         </w:rPr>
-        <w:t>Titanic</w:t>
-      </w:r>
-      <w:proofErr w:type="spellEnd"/>
+        <w:t>Titanic - Machine Learning from Disaster</w:t>
+      </w:r>
+      <w:r>
+        <w:rPr>
+          <w:lang w:val="es-CL"/>
+        </w:rPr>
+        <w:t xml:space="preserve">), con 891 registros y 12 variables; la unidad de análisis es cada pasajero individual identificado por </w:t>
+      </w:r>
       <w:r>
         <w:rPr>
           <w:i/>
           <w:lang w:val="es-CL"/>
         </w:rPr>
-        <w:t xml:space="preserve"> - Machine </w:t>
-      </w:r>
-      <w:proofErr w:type="spellStart"/>
+        <w:t>PassengerId</w:t>
+      </w:r>
+      <w:r>
+        <w:rPr>
+          <w:lang w:val="es-CL"/>
+        </w:rPr>
+        <w:t xml:space="preserve">. Para el ejercicio de integración exigido en esta fase se incorporó una </w:t>
+      </w:r>
+      <w:r>
+        <w:rPr>
+          <w:b/>
+          <w:lang w:val="es-CL"/>
+        </w:rPr>
+        <w:t>fuente complementaria de origen web</w:t>
+      </w:r>
+      <w:r>
+        <w:rPr>
+          <w:lang w:val="es-CL"/>
+        </w:rPr>
+        <w:t xml:space="preserve">: el dataset </w:t>
+      </w:r>
       <w:r>
         <w:rPr>
           <w:i/>
           <w:lang w:val="es-CL"/>
         </w:rPr>
-        <w:t>Learning</w:t>
-      </w:r>
-      <w:proofErr w:type="spellEnd"/>
+        <w:t>titanic</w:t>
+      </w:r>
+      <w:r>
+        <w:rPr>
+          <w:lang w:val="es-CL"/>
+        </w:rPr>
+        <w:t xml:space="preserve"> del repositorio público </w:t>
+      </w:r>
       <w:r>
         <w:rPr>
           <w:i/>
           <w:lang w:val="es-CL"/>
         </w:rPr>
-        <w:t xml:space="preserve"> </w:t>
-      </w:r>
-      <w:proofErr w:type="spellStart"/>
+        <w:t>seaborn-data</w:t>
+      </w:r>
+      <w:r>
+        <w:rPr>
+          <w:lang w:val="es-CL"/>
+        </w:rPr>
+        <w:t xml:space="preserve"> (891 registros, 15 variables), que describe al mismo universo de pasajeros con variables adicionales (</w:t>
+      </w:r>
       <w:r>
         <w:rPr>
           <w:i/>
           <w:lang w:val="es-CL"/>
         </w:rPr>
-        <w:t>from</w:t>
-      </w:r>
-      <w:proofErr w:type="spellEnd"/>
-      <w:r>
-        <w:rPr>
-          <w:i/>
-          <w:lang w:val="es-CL"/>
-        </w:rPr>
-        <w:t xml:space="preserve"> </w:t>
-      </w:r>
-      <w:proofErr w:type="spellStart"/>
-      <w:r>
-        <w:rPr>
-          <w:i/>
-          <w:lang w:val="es-CL"/>
-        </w:rPr>
-        <w:t>Disaster</w:t>
-      </w:r>
-      <w:proofErr w:type="spellEnd"/>
-      <w:r>
-        <w:rPr>
-          <w:lang w:val="es-CL"/>
-        </w:rPr>
-        <w:t xml:space="preserve">), con 891 registros y 12 variables; la unidad de análisis es cada pasajero individual identificado por </w:t>
-      </w:r>
-      <w:proofErr w:type="spellStart"/>
-      <w:r>
-        <w:rPr>
-          <w:i/>
-          <w:lang w:val="es-CL"/>
-        </w:rPr>
-        <w:t>PassengerId</w:t>
-      </w:r>
-      <w:proofErr w:type="spellEnd"/>
-      <w:r>
-        <w:rPr>
-          <w:lang w:val="es-CL"/>
-        </w:rPr>
-        <w:t xml:space="preserve">. Para el ejercicio de integración exigido en esta fase se incorporó una </w:t>
-      </w:r>
-      <w:r>
-        <w:rPr>
-          <w:b/>
-          <w:lang w:val="es-CL"/>
-        </w:rPr>
-        <w:t>fuente complementaria de origen web</w:t>
-      </w:r>
-      <w:r>
-        <w:rPr>
-          <w:lang w:val="es-CL"/>
-        </w:rPr>
-        <w:t xml:space="preserve">: el </w:t>
-      </w:r>
-      <w:proofErr w:type="spellStart"/>
-      <w:r>
-        <w:rPr>
-          <w:lang w:val="es-CL"/>
-        </w:rPr>
-        <w:t>dataset</w:t>
-      </w:r>
-      <w:proofErr w:type="spellEnd"/>
-      <w:r>
-        <w:rPr>
-          <w:lang w:val="es-CL"/>
-        </w:rPr>
-        <w:t xml:space="preserve"> </w:t>
-      </w:r>
-      <w:proofErr w:type="spellStart"/>
-      <w:r>
-        <w:rPr>
-          <w:i/>
-          <w:lang w:val="es-CL"/>
-        </w:rPr>
-        <w:t>titanic</w:t>
-      </w:r>
-      <w:proofErr w:type="spellEnd"/>
-      <w:r>
-        <w:rPr>
-          <w:lang w:val="es-CL"/>
-        </w:rPr>
-        <w:t xml:space="preserve"> del repositorio público </w:t>
-      </w:r>
-      <w:proofErr w:type="spellStart"/>
-      <w:r>
-        <w:rPr>
-          <w:i/>
-          <w:lang w:val="es-CL"/>
-        </w:rPr>
-        <w:t>seaborn</w:t>
-      </w:r>
-      <w:proofErr w:type="spellEnd"/>
-      <w:r>
-        <w:rPr>
-          <w:i/>
-          <w:lang w:val="es-CL"/>
-        </w:rPr>
-        <w:t>-data</w:t>
-      </w:r>
-      <w:r>
-        <w:rPr>
-          <w:lang w:val="es-CL"/>
-        </w:rPr>
-        <w:t xml:space="preserve"> (891 registros, 15 variables), que describe al mismo universo de pasajeros con variables adicionales (</w:t>
-      </w:r>
-      <w:proofErr w:type="spellStart"/>
-      <w:r>
-        <w:rPr>
-          <w:i/>
-          <w:lang w:val="es-CL"/>
-        </w:rPr>
-        <w:t>class</w:t>
-      </w:r>
-      <w:proofErr w:type="spellEnd"/>
-      <w:r>
-        <w:rPr>
-          <w:i/>
-          <w:lang w:val="es-CL"/>
-        </w:rPr>
-        <w:t xml:space="preserve">, </w:t>
-      </w:r>
-      <w:proofErr w:type="spellStart"/>
-      <w:r>
-        <w:rPr>
-          <w:i/>
-          <w:lang w:val="es-CL"/>
-        </w:rPr>
-        <w:t>who</w:t>
-      </w:r>
-      <w:proofErr w:type="spellEnd"/>
-      <w:r>
-        <w:rPr>
-          <w:i/>
-          <w:lang w:val="es-CL"/>
-        </w:rPr>
-        <w:t xml:space="preserve">, </w:t>
-      </w:r>
-      <w:proofErr w:type="spellStart"/>
-      <w:r>
-        <w:rPr>
-          <w:i/>
-          <w:lang w:val="es-CL"/>
-        </w:rPr>
-        <w:t>adult_male</w:t>
-      </w:r>
-      <w:proofErr w:type="spellEnd"/>
-      <w:r>
-        <w:rPr>
-          <w:i/>
-          <w:lang w:val="es-CL"/>
-        </w:rPr>
-        <w:t xml:space="preserve">, </w:t>
-      </w:r>
-      <w:proofErr w:type="spellStart"/>
-      <w:r>
-        <w:rPr>
-          <w:i/>
-          <w:lang w:val="es-CL"/>
-        </w:rPr>
-        <w:t>deck</w:t>
-      </w:r>
-      <w:proofErr w:type="spellEnd"/>
-      <w:r>
-        <w:rPr>
-          <w:i/>
-          <w:lang w:val="es-CL"/>
-        </w:rPr>
-        <w:t xml:space="preserve">, </w:t>
-      </w:r>
-      <w:proofErr w:type="spellStart"/>
-      <w:r>
-        <w:rPr>
-          <w:i/>
-          <w:lang w:val="es-CL"/>
-        </w:rPr>
-        <w:t>embark_town</w:t>
-      </w:r>
-      <w:proofErr w:type="spellEnd"/>
-      <w:r>
-        <w:rPr>
-          <w:i/>
-          <w:lang w:val="es-CL"/>
-        </w:rPr>
-        <w:t>, alone</w:t>
+        <w:t>class, who, adult_male, deck, embark_town, alone</w:t>
       </w:r>
       <w:r>
         <w:rPr>
@@ -736,269 +510,78 @@
         </w:rPr>
         <w:t>), discretas (</w:t>
       </w:r>
-      <w:proofErr w:type="spellStart"/>
       <w:r>
         <w:rPr>
           <w:i/>
           <w:lang w:val="es-CL"/>
         </w:rPr>
-        <w:t>Pclass</w:t>
-      </w:r>
-      <w:proofErr w:type="spellEnd"/>
+        <w:t>Pclass, SibSp, Parch</w:t>
+      </w:r>
+      <w:r>
+        <w:rPr>
+          <w:lang w:val="es-CL"/>
+        </w:rPr>
+        <w:t xml:space="preserve">), la variable objetivo binaria </w:t>
+      </w:r>
       <w:r>
         <w:rPr>
           <w:i/>
           <w:lang w:val="es-CL"/>
         </w:rPr>
-        <w:t xml:space="preserve">, </w:t>
-      </w:r>
-      <w:proofErr w:type="spellStart"/>
+        <w:t>Survived</w:t>
+      </w:r>
+      <w:r>
+        <w:rPr>
+          <w:lang w:val="es-CL"/>
+        </w:rPr>
+        <w:t>, y variables categóricas/texto (</w:t>
+      </w:r>
       <w:r>
         <w:rPr>
           <w:i/>
           <w:lang w:val="es-CL"/>
         </w:rPr>
-        <w:t>SibSp</w:t>
-      </w:r>
-      <w:proofErr w:type="spellEnd"/>
+        <w:t>Sex, Embarked, Name, Ticket, Cabin</w:t>
+      </w:r>
+      <w:r>
+        <w:rPr>
+          <w:lang w:val="es-CL"/>
+        </w:rPr>
+        <w:t xml:space="preserve">). Para este avance, las variables priorizadas son </w:t>
+      </w:r>
       <w:r>
         <w:rPr>
           <w:i/>
           <w:lang w:val="es-CL"/>
         </w:rPr>
-        <w:t xml:space="preserve">, </w:t>
-      </w:r>
-      <w:proofErr w:type="spellStart"/>
+        <w:t>Survived</w:t>
+      </w:r>
+      <w:r>
+        <w:rPr>
+          <w:lang w:val="es-CL"/>
+        </w:rPr>
+        <w:t xml:space="preserve"> (objetivo), </w:t>
+      </w:r>
       <w:r>
         <w:rPr>
           <w:i/>
           <w:lang w:val="es-CL"/>
         </w:rPr>
-        <w:t>Parch</w:t>
-      </w:r>
-      <w:proofErr w:type="spellEnd"/>
-      <w:r>
-        <w:rPr>
-          <w:lang w:val="es-CL"/>
-        </w:rPr>
-        <w:t xml:space="preserve">), la variable </w:t>
-      </w:r>
-      <w:proofErr w:type="gramStart"/>
-      <w:r>
-        <w:rPr>
-          <w:lang w:val="es-CL"/>
-        </w:rPr>
-        <w:t>objetivo binaria</w:t>
-      </w:r>
-      <w:proofErr w:type="gramEnd"/>
-      <w:r>
-        <w:rPr>
-          <w:lang w:val="es-CL"/>
-        </w:rPr>
-        <w:t xml:space="preserve"> </w:t>
-      </w:r>
-      <w:proofErr w:type="spellStart"/>
+        <w:t>Sex, Pclass, Age, Fare, Embarked</w:t>
+      </w:r>
+      <w:r>
+        <w:rPr>
+          <w:lang w:val="es-CL"/>
+        </w:rPr>
+        <w:t xml:space="preserve"> y las derivadas construidas en el proceso (</w:t>
+      </w:r>
       <w:r>
         <w:rPr>
           <w:i/>
           <w:lang w:val="es-CL"/>
         </w:rPr>
-        <w:t>Survived</w:t>
-      </w:r>
-      <w:proofErr w:type="spellEnd"/>
-      <w:r>
-        <w:rPr>
-          <w:lang w:val="es-CL"/>
-        </w:rPr>
-        <w:t>, y variables categóricas/texto (</w:t>
-      </w:r>
-      <w:r>
-        <w:rPr>
-          <w:i/>
-          <w:lang w:val="es-CL"/>
-        </w:rPr>
-        <w:t xml:space="preserve">Sex, </w:t>
-      </w:r>
-      <w:proofErr w:type="spellStart"/>
-      <w:r>
-        <w:rPr>
-          <w:i/>
-          <w:lang w:val="es-CL"/>
-        </w:rPr>
-        <w:t>Embarked</w:t>
-      </w:r>
-      <w:proofErr w:type="spellEnd"/>
-      <w:r>
-        <w:rPr>
-          <w:i/>
-          <w:lang w:val="es-CL"/>
-        </w:rPr>
-        <w:t xml:space="preserve">, Name, </w:t>
-      </w:r>
-      <w:proofErr w:type="gramStart"/>
-      <w:r>
-        <w:rPr>
-          <w:i/>
-          <w:lang w:val="es-CL"/>
-        </w:rPr>
-        <w:t>Ticket</w:t>
-      </w:r>
-      <w:proofErr w:type="gramEnd"/>
-      <w:r>
-        <w:rPr>
-          <w:i/>
-          <w:lang w:val="es-CL"/>
-        </w:rPr>
-        <w:t>, Cabin</w:t>
-      </w:r>
-      <w:r>
-        <w:rPr>
-          <w:lang w:val="es-CL"/>
-        </w:rPr>
-        <w:t xml:space="preserve">). Para este avance, las variables priorizadas son </w:t>
-      </w:r>
-      <w:proofErr w:type="spellStart"/>
-      <w:r>
-        <w:rPr>
-          <w:i/>
-          <w:lang w:val="es-CL"/>
-        </w:rPr>
-        <w:t>Survived</w:t>
-      </w:r>
-      <w:proofErr w:type="spellEnd"/>
-      <w:r>
-        <w:rPr>
-          <w:lang w:val="es-CL"/>
-        </w:rPr>
-        <w:t xml:space="preserve"> (objetivo), </w:t>
-      </w:r>
-      <w:r>
-        <w:rPr>
-          <w:i/>
-          <w:lang w:val="es-CL"/>
-        </w:rPr>
-        <w:t xml:space="preserve">Sex, </w:t>
-      </w:r>
-      <w:proofErr w:type="spellStart"/>
-      <w:r>
-        <w:rPr>
-          <w:i/>
-          <w:lang w:val="es-CL"/>
-        </w:rPr>
-        <w:t>Pclass</w:t>
-      </w:r>
-      <w:proofErr w:type="spellEnd"/>
-      <w:r>
-        <w:rPr>
-          <w:i/>
-          <w:lang w:val="es-CL"/>
-        </w:rPr>
-        <w:t xml:space="preserve">, Age, Fare, </w:t>
-      </w:r>
-      <w:proofErr w:type="spellStart"/>
-      <w:r>
-        <w:rPr>
-          <w:i/>
-          <w:lang w:val="es-CL"/>
-        </w:rPr>
-        <w:t>Embarked</w:t>
-      </w:r>
-      <w:proofErr w:type="spellEnd"/>
-      <w:r>
-        <w:rPr>
-          <w:lang w:val="es-CL"/>
-        </w:rPr>
-        <w:t xml:space="preserve"> y las derivadas construidas en el proceso (</w:t>
-      </w:r>
-      <w:proofErr w:type="spellStart"/>
-      <w:r>
-        <w:rPr>
-          <w:i/>
-          <w:lang w:val="es-CL"/>
-        </w:rPr>
-        <w:t>Title_agrupado</w:t>
-      </w:r>
-      <w:proofErr w:type="spellEnd"/>
-      <w:r>
-        <w:rPr>
-          <w:i/>
-          <w:lang w:val="es-CL"/>
-        </w:rPr>
-        <w:t xml:space="preserve">, </w:t>
-      </w:r>
-      <w:proofErr w:type="spellStart"/>
-      <w:r>
-        <w:rPr>
-          <w:i/>
-          <w:lang w:val="es-CL"/>
-        </w:rPr>
-        <w:t>FamilySize</w:t>
-      </w:r>
-      <w:proofErr w:type="spellEnd"/>
-      <w:r>
-        <w:rPr>
-          <w:i/>
-          <w:lang w:val="es-CL"/>
-        </w:rPr>
-        <w:t xml:space="preserve">, </w:t>
-      </w:r>
-      <w:proofErr w:type="spellStart"/>
-      <w:r>
-        <w:rPr>
-          <w:i/>
-          <w:lang w:val="es-CL"/>
-        </w:rPr>
-        <w:t>IsAlone</w:t>
-      </w:r>
-      <w:proofErr w:type="spellEnd"/>
-      <w:r>
-        <w:rPr>
-          <w:i/>
-          <w:lang w:val="es-CL"/>
-        </w:rPr>
-        <w:t xml:space="preserve">, </w:t>
-      </w:r>
-      <w:proofErr w:type="spellStart"/>
-      <w:r>
-        <w:rPr>
-          <w:i/>
-          <w:lang w:val="es-CL"/>
-        </w:rPr>
-        <w:t>AgeGroup</w:t>
-      </w:r>
-      <w:proofErr w:type="spellEnd"/>
-      <w:r>
-        <w:rPr>
-          <w:i/>
-          <w:lang w:val="es-CL"/>
-        </w:rPr>
-        <w:t xml:space="preserve">, </w:t>
-      </w:r>
-      <w:proofErr w:type="spellStart"/>
-      <w:r>
-        <w:rPr>
-          <w:i/>
-          <w:lang w:val="es-CL"/>
-        </w:rPr>
-        <w:t>Fare_log</w:t>
-      </w:r>
-      <w:proofErr w:type="spellEnd"/>
-      <w:r>
-        <w:rPr>
-          <w:i/>
-          <w:lang w:val="es-CL"/>
-        </w:rPr>
-        <w:t xml:space="preserve">, </w:t>
-      </w:r>
-      <w:proofErr w:type="spellStart"/>
-      <w:r>
-        <w:rPr>
-          <w:i/>
-          <w:lang w:val="es-CL"/>
-        </w:rPr>
-        <w:t>Deck_combinado</w:t>
-      </w:r>
-      <w:proofErr w:type="spellEnd"/>
+        <w:t>Title_agrupado, FamilySize, IsAlone, AgeGroup, Fare_log, Deck_combinado</w:t>
+      </w:r>
       <w:r>
         <w:rPr>
           <w:lang w:val="es-CL"/>
@@ -1266,16 +849,8 @@
               <w:rPr>
                 <w:sz w:val="19"/>
               </w:rPr>
-              <w:t xml:space="preserve">15 </w:t>
+              <w:t>15 casos</w:t>
             </w:r>
-            <w:proofErr w:type="spellStart"/>
-            <w:r>
-              <w:rPr>
-                <w:sz w:val="19"/>
-              </w:rPr>
-              <w:t>casos</w:t>
-            </w:r>
-            <w:proofErr w:type="spellEnd"/>
           </w:p>
         </w:tc>
       </w:tr>
@@ -1324,30 +899,8 @@
               <w:rPr>
                 <w:sz w:val="19"/>
               </w:rPr>
-              <w:t xml:space="preserve">210 </w:t>
+              <w:t>210 valores repetidos</w:t>
             </w:r>
-            <w:proofErr w:type="spellStart"/>
-            <w:r>
-              <w:rPr>
-                <w:sz w:val="19"/>
-              </w:rPr>
-              <w:t>valores</w:t>
-            </w:r>
-            <w:proofErr w:type="spellEnd"/>
-            <w:r>
-              <w:rPr>
-                <w:sz w:val="19"/>
-              </w:rPr>
-              <w:t xml:space="preserve"> </w:t>
-            </w:r>
-            <w:proofErr w:type="spellStart"/>
-            <w:r>
-              <w:rPr>
-                <w:sz w:val="19"/>
-              </w:rPr>
-              <w:t>repetidos</w:t>
-            </w:r>
-            <w:proofErr w:type="spellEnd"/>
           </w:p>
         </w:tc>
       </w:tr>
@@ -1419,105 +972,60 @@
           <w:i/>
           <w:lang w:val="es-CL"/>
         </w:rPr>
-        <w:t xml:space="preserve">Sex, </w:t>
-      </w:r>
-      <w:proofErr w:type="spellStart"/>
+        <w:t>Sex, Embarked, Pclass, Survived</w:t>
+      </w:r>
+      <w:r>
+        <w:rPr>
+          <w:lang w:val="es-CL"/>
+        </w:rPr>
+        <w:t xml:space="preserve"> o edades inválidas). El campo crítico para la preparación posterior es </w:t>
+      </w:r>
       <w:r>
         <w:rPr>
           <w:i/>
           <w:lang w:val="es-CL"/>
         </w:rPr>
-        <w:t>Embarked</w:t>
-      </w:r>
-      <w:proofErr w:type="spellEnd"/>
+        <w:t>Age</w:t>
+      </w:r>
+      <w:r>
+        <w:rPr>
+          <w:lang w:val="es-CL"/>
+        </w:rPr>
+        <w:t xml:space="preserve"> (proporción relevante de faltantes) y, especialmente, </w:t>
+      </w:r>
       <w:r>
         <w:rPr>
           <w:i/>
           <w:lang w:val="es-CL"/>
         </w:rPr>
-        <w:t xml:space="preserve">, </w:t>
-      </w:r>
-      <w:proofErr w:type="spellStart"/>
+        <w:t>Cabin</w:t>
+      </w:r>
+      <w:r>
+        <w:rPr>
+          <w:lang w:val="es-CL"/>
+        </w:rPr>
+        <w:t>: la proporción de camarote registrado decrece fuertemente desde primera hacia tercera clase (81.5% / 8.7% / 2.4%), asociación confirmada mediante una prueba chi-cuadrado formal (</w:t>
+      </w:r>
       <w:r>
         <w:rPr>
           <w:i/>
           <w:lang w:val="es-CL"/>
         </w:rPr>
+        <w:t>Cabin_registrada</w:t>
+      </w:r>
+      <w:r>
+        <w:rPr>
+          <w:lang w:val="es-CL"/>
+        </w:rPr>
+        <w:t xml:space="preserve"> ~ </w:t>
+      </w:r>
+      <w:r>
+        <w:rPr>
+          <w:i/>
+          <w:lang w:val="es-CL"/>
+        </w:rPr>
         <w:t>Pclass</w:t>
       </w:r>
-      <w:proofErr w:type="spellEnd"/>
-      <w:r>
-        <w:rPr>
-          <w:i/>
-          <w:lang w:val="es-CL"/>
-        </w:rPr>
-        <w:t xml:space="preserve">, </w:t>
-      </w:r>
-      <w:proofErr w:type="spellStart"/>
-      <w:r>
-        <w:rPr>
-          <w:i/>
-          <w:lang w:val="es-CL"/>
-        </w:rPr>
-        <w:t>Survived</w:t>
-      </w:r>
-      <w:proofErr w:type="spellEnd"/>
-      <w:r>
-        <w:rPr>
-          <w:lang w:val="es-CL"/>
-        </w:rPr>
-        <w:t xml:space="preserve"> o edades inválidas). El campo crítico para la preparación posterior es </w:t>
-      </w:r>
-      <w:r>
-        <w:rPr>
-          <w:i/>
-          <w:lang w:val="es-CL"/>
-        </w:rPr>
-        <w:t>Age</w:t>
-      </w:r>
-      <w:r>
-        <w:rPr>
-          <w:lang w:val="es-CL"/>
-        </w:rPr>
-        <w:t xml:space="preserve"> (proporción relevante de faltantes) y, especialmente, </w:t>
-      </w:r>
-      <w:r>
-        <w:rPr>
-          <w:i/>
-          <w:lang w:val="es-CL"/>
-        </w:rPr>
-        <w:t>Cabin</w:t>
-      </w:r>
-      <w:r>
-        <w:rPr>
-          <w:lang w:val="es-CL"/>
-        </w:rPr>
-        <w:t>: la proporción de camarote registrado decrece fuertemente desde primera hacia tercera clase (81.5% / 8.7% / 2.4%), asociación confirmada mediante una prueba chi-cuadrado formal (</w:t>
-      </w:r>
-      <w:proofErr w:type="spellStart"/>
-      <w:r>
-        <w:rPr>
-          <w:i/>
-          <w:lang w:val="es-CL"/>
-        </w:rPr>
-        <w:t>Cabin_registrada</w:t>
-      </w:r>
-      <w:proofErr w:type="spellEnd"/>
-      <w:r>
-        <w:rPr>
-          <w:lang w:val="es-CL"/>
-        </w:rPr>
-        <w:t xml:space="preserve"> ~ </w:t>
-      </w:r>
-      <w:proofErr w:type="spellStart"/>
-      <w:r>
-        <w:rPr>
-          <w:i/>
-          <w:lang w:val="es-CL"/>
-        </w:rPr>
-        <w:t>Pclass</w:t>
-      </w:r>
-      <w:proofErr w:type="spellEnd"/>
       <w:r>
         <w:rPr>
           <w:lang w:val="es-CL"/>
@@ -1529,29 +1037,13 @@
           <w:b/>
           <w:lang w:val="es-CL"/>
         </w:rPr>
-        <w:t xml:space="preserve">estructural (asociada a </w:t>
-      </w:r>
-      <w:proofErr w:type="spellStart"/>
-      <w:r>
-        <w:rPr>
-          <w:b/>
-          <w:lang w:val="es-CL"/>
-        </w:rPr>
-        <w:t>Pclass</w:t>
-      </w:r>
-      <w:proofErr w:type="spellEnd"/>
-      <w:r>
-        <w:rPr>
-          <w:b/>
-          <w:lang w:val="es-CL"/>
-        </w:rPr>
-        <w:t>) y no aleatoria</w:t>
-      </w:r>
-      <w:r>
-        <w:rPr>
-          <w:lang w:val="es-CL"/>
-        </w:rPr>
-        <w:t>, lo que descarta una imputación directa del valor específico.</w:t>
+        <w:t>estructural (asociada a Pclass) y no aleatoria</w:t>
+      </w:r>
+      <w:r>
+        <w:rPr>
+          <w:lang w:val="es-CL"/>
+        </w:rPr>
+        <w:t>, lo que descarta una imputación directa del valor específico (véase notebook, apartado IV).</w:t>
       </w:r>
     </w:p>
     <w:p>
@@ -1578,128 +1070,78 @@
           <w:lang w:val="es-CL"/>
         </w:rPr>
       </w:pPr>
-      <w:proofErr w:type="spellStart"/>
       <w:r>
         <w:rPr>
           <w:b/>
           <w:lang w:val="es-CL"/>
         </w:rPr>
-        <w:t>Embarked</w:t>
-      </w:r>
-      <w:proofErr w:type="spellEnd"/>
+        <w:t>Embarked:</w:t>
+      </w:r>
+      <w:r>
+        <w:rPr>
+          <w:lang w:val="es-CL"/>
+        </w:rPr>
+        <w:t xml:space="preserve"> los 2 valores faltantes se imputaron de forma definitiva con la moda ("S"), dado su peso marginal (0.22%). </w:t>
+      </w:r>
       <w:r>
         <w:rPr>
           <w:b/>
           <w:lang w:val="es-CL"/>
         </w:rPr>
-        <w:t>:</w:t>
-      </w:r>
-      <w:r>
-        <w:rPr>
-          <w:lang w:val="es-CL"/>
-        </w:rPr>
-        <w:t xml:space="preserve"> los 2 valores faltantes se imputaron de forma definitiva con la moda ("S"), dado su peso marginal (0.22%). </w:t>
+        <w:t>Age:</w:t>
+      </w:r>
+      <w:r>
+        <w:rPr>
+          <w:lang w:val="es-CL"/>
+        </w:rPr>
+        <w:t xml:space="preserve"> se imputó con la mediana estratificada por </w:t>
+      </w:r>
+      <w:r>
+        <w:rPr>
+          <w:i/>
+          <w:lang w:val="es-CL"/>
+        </w:rPr>
+        <w:t>Pclass × Sex</w:t>
+      </w:r>
+      <w:r>
+        <w:rPr>
+          <w:lang w:val="es-CL"/>
+        </w:rPr>
+        <w:t xml:space="preserve"> —no con una mediana global—; un test de Kruskal-Wallis confirma diferencias significativas de edad entre esos grupos (H=112.28; p&lt;0.001), lo que motiva la estratificación (una mediana global subestimaría/sobrestimaría la edad en varios subgrupos), aunque el test no mide directamente el error de imputación de una estrategia frente a la otra. Se conservó el indicador </w:t>
+      </w:r>
+      <w:r>
+        <w:rPr>
+          <w:i/>
+          <w:lang w:val="es-CL"/>
+        </w:rPr>
+        <w:t>Age_registrada</w:t>
+      </w:r>
+      <w:r>
+        <w:rPr>
+          <w:lang w:val="es-CL"/>
+        </w:rPr>
+        <w:t xml:space="preserve"> para no perder la señal de valor imputado. </w:t>
       </w:r>
       <w:r>
         <w:rPr>
           <w:b/>
           <w:lang w:val="es-CL"/>
         </w:rPr>
-        <w:t>Age:</w:t>
-      </w:r>
-      <w:r>
-        <w:rPr>
-          <w:lang w:val="es-CL"/>
-        </w:rPr>
-        <w:t xml:space="preserve"> se imputó con la mediana estratificada por </w:t>
-      </w:r>
-      <w:proofErr w:type="spellStart"/>
+        <w:t>Cabin:</w:t>
+      </w:r>
+      <w:r>
+        <w:rPr>
+          <w:lang w:val="es-CL"/>
+        </w:rPr>
+        <w:t xml:space="preserve"> no se imputa el camarote específico; se conserva únicamente un indicador de registro (</w:t>
+      </w:r>
       <w:r>
         <w:rPr>
           <w:i/>
           <w:lang w:val="es-CL"/>
         </w:rPr>
-        <w:t>Pclass</w:t>
-      </w:r>
-      <w:proofErr w:type="spellEnd"/>
-      <w:r>
-        <w:rPr>
-          <w:i/>
-          <w:lang w:val="es-CL"/>
-        </w:rPr>
-        <w:t xml:space="preserve"> × Sex</w:t>
-      </w:r>
-      <w:r>
-        <w:rPr>
-          <w:lang w:val="es-CL"/>
-        </w:rPr>
-        <w:t xml:space="preserve"> —no con una mediana global—; </w:t>
-      </w:r>
-      <w:proofErr w:type="gramStart"/>
-      <w:r>
-        <w:rPr>
-          <w:lang w:val="es-CL"/>
-        </w:rPr>
-        <w:t>un test</w:t>
-      </w:r>
-      <w:proofErr w:type="gramEnd"/>
-      <w:r>
-        <w:rPr>
-          <w:lang w:val="es-CL"/>
-        </w:rPr>
-        <w:t xml:space="preserve"> de Kruskal-Wallis confirma diferencias significativas de edad entre esos grupos (H=112.28; p&lt;0.001), lo que motiva la estratificación (una mediana global subestimaría/sobrestimaría la edad en varios subgrupos), aunque </w:t>
-      </w:r>
-      <w:proofErr w:type="gramStart"/>
-      <w:r>
-        <w:rPr>
-          <w:lang w:val="es-CL"/>
-        </w:rPr>
-        <w:t>el test</w:t>
-      </w:r>
-      <w:proofErr w:type="gramEnd"/>
-      <w:r>
-        <w:rPr>
-          <w:lang w:val="es-CL"/>
-        </w:rPr>
-        <w:t xml:space="preserve"> no mide directamente el error de imputación de una estrategia frente a la otra. Se conservó el indicador </w:t>
-      </w:r>
-      <w:proofErr w:type="spellStart"/>
-      <w:r>
-        <w:rPr>
-          <w:i/>
-          <w:lang w:val="es-CL"/>
-        </w:rPr>
-        <w:t>Age_registrada</w:t>
-      </w:r>
-      <w:proofErr w:type="spellEnd"/>
-      <w:r>
-        <w:rPr>
-          <w:lang w:val="es-CL"/>
-        </w:rPr>
-        <w:t xml:space="preserve"> para no perder la señal de valor imputado. </w:t>
-      </w:r>
-      <w:r>
-        <w:rPr>
-          <w:b/>
-          <w:lang w:val="es-CL"/>
-        </w:rPr>
-        <w:t>Cabin:</w:t>
-      </w:r>
-      <w:r>
-        <w:rPr>
-          <w:lang w:val="es-CL"/>
-        </w:rPr>
-        <w:t xml:space="preserve"> no se imputa el camarote específico; se conserva únicamente un indicador de registro (</w:t>
-      </w:r>
-      <w:proofErr w:type="spellStart"/>
-      <w:r>
-        <w:rPr>
-          <w:i/>
-          <w:lang w:val="es-CL"/>
-        </w:rPr>
         <w:t>Cabin_registrada</w:t>
       </w:r>
-      <w:proofErr w:type="spellEnd"/>
       <w:r>
         <w:rPr>
           <w:lang w:val="es-CL"/>
@@ -1727,303 +1169,161 @@
         </w:rPr>
         <w:t xml:space="preserve"> dado que ninguna de las dos fuentes comparte un identificador explícito, la validez de la integración se estableció comprobando la coincidencia de siete variables conceptualmente equivalentes entre ambas fuentes (</w:t>
       </w:r>
-      <w:proofErr w:type="spellStart"/>
       <w:r>
         <w:rPr>
           <w:i/>
           <w:lang w:val="es-CL"/>
         </w:rPr>
+        <w:t>Pclass, Sex, SibSp, Parch, Survived, Fare, Age</w:t>
+      </w:r>
+      <w:r>
+        <w:rPr>
+          <w:lang w:val="es-CL"/>
+        </w:rPr>
+        <w:t xml:space="preserve">), obteniendo una coincidencia del </w:t>
+      </w:r>
+      <w:r>
+        <w:rPr>
+          <w:b/>
+          <w:lang w:val="es-CL"/>
+        </w:rPr>
+        <w:t>100%</w:t>
+      </w:r>
+      <w:r>
+        <w:rPr>
+          <w:lang w:val="es-CL"/>
+        </w:rPr>
+        <w:t xml:space="preserve">, lo que confirma que ambas fuentes están alineadas registro a registro. Se incorporaron entonces las variables </w:t>
+      </w:r>
+      <w:r>
+        <w:rPr>
+          <w:i/>
+          <w:lang w:val="es-CL"/>
+        </w:rPr>
+        <w:t>class, who, adult_male, deck, embark_town, alone</w:t>
+      </w:r>
+      <w:r>
+        <w:rPr>
+          <w:lang w:val="es-CL"/>
+        </w:rPr>
+        <w:t xml:space="preserve">, validando además su </w:t>
+      </w:r>
+      <w:r>
+        <w:rPr>
+          <w:b/>
+          <w:lang w:val="es-CL"/>
+        </w:rPr>
+        <w:t>coherencia semántica</w:t>
+      </w:r>
+      <w:r>
+        <w:rPr>
+          <w:lang w:val="es-CL"/>
+        </w:rPr>
+        <w:t xml:space="preserve">: </w:t>
+      </w:r>
+      <w:r>
+        <w:rPr>
+          <w:i/>
+          <w:lang w:val="es-CL"/>
+        </w:rPr>
+        <w:t>Embarked</w:t>
+      </w:r>
+      <w:r>
+        <w:rPr>
+          <w:lang w:val="es-CL"/>
+        </w:rPr>
+        <w:t xml:space="preserve"> vs. </w:t>
+      </w:r>
+      <w:r>
+        <w:rPr>
+          <w:i/>
+          <w:lang w:val="es-CL"/>
+        </w:rPr>
+        <w:t>embark_town</w:t>
+      </w:r>
+      <w:r>
+        <w:rPr>
+          <w:lang w:val="es-CL"/>
+        </w:rPr>
+        <w:t xml:space="preserve"> (889 casos comparables) y </w:t>
+      </w:r>
+      <w:r>
+        <w:rPr>
+          <w:i/>
+          <w:lang w:val="es-CL"/>
+        </w:rPr>
         <w:t>Pclass</w:t>
       </w:r>
-      <w:proofErr w:type="spellEnd"/>
+      <w:r>
+        <w:rPr>
+          <w:lang w:val="es-CL"/>
+        </w:rPr>
+        <w:t xml:space="preserve"> vs. </w:t>
+      </w:r>
       <w:r>
         <w:rPr>
           <w:i/>
           <w:lang w:val="es-CL"/>
         </w:rPr>
-        <w:t xml:space="preserve">, Sex, </w:t>
-      </w:r>
-      <w:proofErr w:type="spellStart"/>
+        <w:t>class</w:t>
+      </w:r>
+      <w:r>
+        <w:rPr>
+          <w:lang w:val="es-CL"/>
+        </w:rPr>
+        <w:t xml:space="preserve"> coinciden de forma perfecta y diagonal, y la primera letra de </w:t>
+      </w:r>
       <w:r>
         <w:rPr>
           <w:i/>
           <w:lang w:val="es-CL"/>
         </w:rPr>
-        <w:t>SibSp</w:t>
-      </w:r>
-      <w:proofErr w:type="spellEnd"/>
+        <w:t>Cabin</w:t>
+      </w:r>
+      <w:r>
+        <w:rPr>
+          <w:lang w:val="es-CL"/>
+        </w:rPr>
+        <w:t xml:space="preserve"> coincide en el 100% de los casos comparables con </w:t>
+      </w:r>
       <w:r>
         <w:rPr>
           <w:i/>
           <w:lang w:val="es-CL"/>
         </w:rPr>
-        <w:t xml:space="preserve">, </w:t>
-      </w:r>
-      <w:proofErr w:type="spellStart"/>
+        <w:t>deck</w:t>
+      </w:r>
+      <w:r>
+        <w:rPr>
+          <w:lang w:val="es-CL"/>
+        </w:rPr>
+        <w:t xml:space="preserve">. La integración no resuelve el faltante de </w:t>
+      </w:r>
       <w:r>
         <w:rPr>
           <w:i/>
           <w:lang w:val="es-CL"/>
         </w:rPr>
-        <w:t>Parch</w:t>
-      </w:r>
-      <w:proofErr w:type="spellEnd"/>
+        <w:t>Cabin</w:t>
+      </w:r>
+      <w:r>
+        <w:rPr>
+          <w:lang w:val="es-CL"/>
+        </w:rPr>
+        <w:t>/</w:t>
+      </w:r>
       <w:r>
         <w:rPr>
           <w:i/>
           <w:lang w:val="es-CL"/>
         </w:rPr>
-        <w:t xml:space="preserve">, </w:t>
-      </w:r>
-      <w:proofErr w:type="spellStart"/>
-      <w:r>
-        <w:rPr>
-          <w:i/>
-          <w:lang w:val="es-CL"/>
-        </w:rPr>
-        <w:t>Survived</w:t>
-      </w:r>
-      <w:proofErr w:type="spellEnd"/>
-      <w:r>
-        <w:rPr>
-          <w:i/>
-          <w:lang w:val="es-CL"/>
-        </w:rPr>
-        <w:t>, Fare, Age</w:t>
-      </w:r>
-      <w:r>
-        <w:rPr>
-          <w:lang w:val="es-CL"/>
-        </w:rPr>
-        <w:t xml:space="preserve">), obteniendo una coincidencia del </w:t>
-      </w:r>
-      <w:r>
-        <w:rPr>
-          <w:b/>
-          <w:lang w:val="es-CL"/>
-        </w:rPr>
-        <w:t>100%</w:t>
-      </w:r>
-      <w:r>
-        <w:rPr>
-          <w:lang w:val="es-CL"/>
-        </w:rPr>
-        <w:t xml:space="preserve">, lo que confirma que ambas fuentes están alineadas registro a registro. Se incorporaron entonces las variables </w:t>
-      </w:r>
-      <w:proofErr w:type="spellStart"/>
-      <w:r>
-        <w:rPr>
-          <w:i/>
-          <w:lang w:val="es-CL"/>
-        </w:rPr>
-        <w:t>class</w:t>
-      </w:r>
-      <w:proofErr w:type="spellEnd"/>
-      <w:r>
-        <w:rPr>
-          <w:i/>
-          <w:lang w:val="es-CL"/>
-        </w:rPr>
-        <w:t xml:space="preserve">, </w:t>
-      </w:r>
-      <w:proofErr w:type="spellStart"/>
-      <w:r>
-        <w:rPr>
-          <w:i/>
-          <w:lang w:val="es-CL"/>
-        </w:rPr>
-        <w:t>who</w:t>
-      </w:r>
-      <w:proofErr w:type="spellEnd"/>
-      <w:r>
-        <w:rPr>
-          <w:i/>
-          <w:lang w:val="es-CL"/>
-        </w:rPr>
-        <w:t xml:space="preserve">, </w:t>
-      </w:r>
-      <w:proofErr w:type="spellStart"/>
-      <w:r>
-        <w:rPr>
-          <w:i/>
-          <w:lang w:val="es-CL"/>
-        </w:rPr>
-        <w:t>adult_male</w:t>
-      </w:r>
-      <w:proofErr w:type="spellEnd"/>
-      <w:r>
-        <w:rPr>
-          <w:i/>
-          <w:lang w:val="es-CL"/>
-        </w:rPr>
-        <w:t xml:space="preserve">, </w:t>
-      </w:r>
-      <w:proofErr w:type="spellStart"/>
-      <w:r>
-        <w:rPr>
-          <w:i/>
-          <w:lang w:val="es-CL"/>
-        </w:rPr>
         <w:t>deck</w:t>
       </w:r>
-      <w:proofErr w:type="spellEnd"/>
-      <w:r>
-        <w:rPr>
-          <w:i/>
-          <w:lang w:val="es-CL"/>
-        </w:rPr>
-        <w:t xml:space="preserve">, </w:t>
-      </w:r>
-      <w:proofErr w:type="spellStart"/>
-      <w:r>
-        <w:rPr>
-          <w:i/>
-          <w:lang w:val="es-CL"/>
-        </w:rPr>
-        <w:t>embark_town</w:t>
-      </w:r>
-      <w:proofErr w:type="spellEnd"/>
-      <w:r>
-        <w:rPr>
-          <w:i/>
-          <w:lang w:val="es-CL"/>
-        </w:rPr>
-        <w:t>, alone</w:t>
-      </w:r>
-      <w:r>
-        <w:rPr>
-          <w:lang w:val="es-CL"/>
-        </w:rPr>
-        <w:t xml:space="preserve">, validando además su </w:t>
-      </w:r>
-      <w:r>
-        <w:rPr>
-          <w:b/>
-          <w:lang w:val="es-CL"/>
-        </w:rPr>
-        <w:t>coherencia semántica</w:t>
-      </w:r>
-      <w:r>
-        <w:rPr>
-          <w:lang w:val="es-CL"/>
-        </w:rPr>
-        <w:t xml:space="preserve">: </w:t>
-      </w:r>
-      <w:proofErr w:type="spellStart"/>
-      <w:r>
-        <w:rPr>
-          <w:i/>
-          <w:lang w:val="es-CL"/>
-        </w:rPr>
-        <w:t>Embarked</w:t>
-      </w:r>
-      <w:proofErr w:type="spellEnd"/>
-      <w:r>
-        <w:rPr>
-          <w:lang w:val="es-CL"/>
-        </w:rPr>
-        <w:t xml:space="preserve"> vs. </w:t>
-      </w:r>
-      <w:proofErr w:type="spellStart"/>
-      <w:r>
-        <w:rPr>
-          <w:i/>
-          <w:lang w:val="es-CL"/>
-        </w:rPr>
-        <w:t>embark_town</w:t>
-      </w:r>
-      <w:proofErr w:type="spellEnd"/>
-      <w:r>
-        <w:rPr>
-          <w:lang w:val="es-CL"/>
-        </w:rPr>
-        <w:t xml:space="preserve"> y </w:t>
-      </w:r>
-      <w:proofErr w:type="spellStart"/>
-      <w:r>
-        <w:rPr>
-          <w:i/>
-          <w:lang w:val="es-CL"/>
-        </w:rPr>
-        <w:t>Pclass</w:t>
-      </w:r>
-      <w:proofErr w:type="spellEnd"/>
-      <w:r>
-        <w:rPr>
-          <w:lang w:val="es-CL"/>
-        </w:rPr>
-        <w:t xml:space="preserve"> vs. </w:t>
-      </w:r>
-      <w:proofErr w:type="spellStart"/>
-      <w:r>
-        <w:rPr>
-          <w:i/>
-          <w:lang w:val="es-CL"/>
-        </w:rPr>
-        <w:t>class</w:t>
-      </w:r>
-      <w:proofErr w:type="spellEnd"/>
-      <w:r>
-        <w:rPr>
-          <w:lang w:val="es-CL"/>
-        </w:rPr>
-        <w:t xml:space="preserve"> coinciden de forma perfecta y diagonal, y la primera letra de </w:t>
-      </w:r>
-      <w:r>
-        <w:rPr>
-          <w:i/>
-          <w:lang w:val="es-CL"/>
-        </w:rPr>
-        <w:t>Cabin</w:t>
-      </w:r>
-      <w:r>
-        <w:rPr>
-          <w:lang w:val="es-CL"/>
-        </w:rPr>
-        <w:t xml:space="preserve"> coincide en el 100% de los casos comparables con </w:t>
-      </w:r>
-      <w:proofErr w:type="spellStart"/>
-      <w:r>
-        <w:rPr>
-          <w:i/>
-          <w:lang w:val="es-CL"/>
-        </w:rPr>
-        <w:t>deck</w:t>
-      </w:r>
-      <w:proofErr w:type="spellEnd"/>
-      <w:r>
-        <w:rPr>
-          <w:lang w:val="es-CL"/>
-        </w:rPr>
-        <w:t xml:space="preserve">. La integración no resuelve el faltante de </w:t>
-      </w:r>
-      <w:r>
-        <w:rPr>
-          <w:i/>
-          <w:lang w:val="es-CL"/>
-        </w:rPr>
-        <w:t>Cabin</w:t>
-      </w:r>
-      <w:r>
-        <w:rPr>
-          <w:lang w:val="es-CL"/>
-        </w:rPr>
-        <w:t>/</w:t>
-      </w:r>
-      <w:proofErr w:type="spellStart"/>
-      <w:r>
-        <w:rPr>
-          <w:i/>
-          <w:lang w:val="es-CL"/>
-        </w:rPr>
-        <w:t>deck</w:t>
-      </w:r>
-      <w:proofErr w:type="spellEnd"/>
-      <w:r>
-        <w:rPr>
-          <w:lang w:val="es-CL"/>
-        </w:rPr>
-        <w:t xml:space="preserve"> (ambas fuentes comparten el mismo patrón de ausencia), pero sí aporta variables complementarias y validación cruzada.</w:t>
+      <w:r>
+        <w:rPr>
+          <w:lang w:val="es-CL"/>
+        </w:rPr>
+        <w:t xml:space="preserve"> (ambas fuentes comparten el mismo patrón de ausencia), pero sí aporta variables complementarias y validación cruzada (véase notebook, apartados V.1 y V.2).</w:t>
       </w:r>
     </w:p>
     <w:p>
@@ -2040,19 +1340,8 @@
           <w:sz w:val="26"/>
           <w:lang w:val="es-CL"/>
         </w:rPr>
-        <w:t xml:space="preserve">V. Transformaciones aplicadas y preparación analítica del </w:t>
-      </w:r>
-      <w:proofErr w:type="spellStart"/>
-      <w:r>
-        <w:rPr>
-          <w:b/>
-          <w:color w:val="1A1A2E"/>
-          <w:sz w:val="26"/>
-          <w:lang w:val="es-CL"/>
-        </w:rPr>
-        <w:t>dataset</w:t>
-      </w:r>
-      <w:proofErr w:type="spellEnd"/>
+        <w:t>V. Transformaciones aplicadas y preparación analítica del dataset</w:t>
+      </w:r>
     </w:p>
     <w:p>
       <w:pPr>
@@ -2067,7 +1356,6 @@
         </w:rPr>
         <w:t xml:space="preserve">Se construyeron variables derivadas con sentido analítico explícito: </w:t>
       </w:r>
-      <w:proofErr w:type="spellStart"/>
       <w:r>
         <w:rPr>
           <w:i/>
@@ -2075,14 +1363,12 @@
         </w:rPr>
         <w:t>Sex_bin</w:t>
       </w:r>
-      <w:proofErr w:type="spellEnd"/>
       <w:r>
         <w:rPr>
           <w:lang w:val="es-CL"/>
         </w:rPr>
         <w:t xml:space="preserve"> (codificación binaria); </w:t>
       </w:r>
-      <w:proofErr w:type="spellStart"/>
       <w:r>
         <w:rPr>
           <w:i/>
@@ -2090,42 +1376,12 @@
         </w:rPr>
         <w:t>Title_agrupado</w:t>
       </w:r>
-      <w:proofErr w:type="spellEnd"/>
-      <w:r>
-        <w:rPr>
-          <w:lang w:val="es-CL"/>
-        </w:rPr>
-        <w:t>, extraído del nombre y consolidado en seis categorías interpretables (</w:t>
-      </w:r>
-      <w:proofErr w:type="spellStart"/>
-      <w:r>
-        <w:rPr>
-          <w:lang w:val="es-CL"/>
-        </w:rPr>
-        <w:t>Mr</w:t>
-      </w:r>
-      <w:proofErr w:type="spellEnd"/>
-      <w:r>
-        <w:rPr>
-          <w:lang w:val="es-CL"/>
-        </w:rPr>
-        <w:t xml:space="preserve"> 58.0%, Miss 20.8%, </w:t>
-      </w:r>
-      <w:proofErr w:type="spellStart"/>
-      <w:r>
-        <w:rPr>
-          <w:lang w:val="es-CL"/>
-        </w:rPr>
-        <w:t>Mrs</w:t>
-      </w:r>
-      <w:proofErr w:type="spellEnd"/>
-      <w:r>
-        <w:rPr>
-          <w:lang w:val="es-CL"/>
-        </w:rPr>
-        <w:t xml:space="preserve"> 14.1%, Master 4.5%, Oficial/Profesional 2.0%, Nobleza 0.6%); </w:t>
-      </w:r>
-      <w:proofErr w:type="spellStart"/>
+      <w:r>
+        <w:rPr>
+          <w:lang w:val="es-CL"/>
+        </w:rPr>
+        <w:t xml:space="preserve">, extraído del nombre y consolidado en seis categorías interpretables (Mr 58.0%, Miss 20.8%, Mrs 14.1%, Master 4.5%, Oficial/Profesional 2.0%, Nobleza 0.6%); </w:t>
+      </w:r>
       <w:r>
         <w:rPr>
           <w:i/>
@@ -2133,14 +1389,12 @@
         </w:rPr>
         <w:t>FamilySize</w:t>
       </w:r>
-      <w:proofErr w:type="spellEnd"/>
       <w:r>
         <w:rPr>
           <w:lang w:val="es-CL"/>
         </w:rPr>
         <w:t xml:space="preserve"> e </w:t>
       </w:r>
-      <w:proofErr w:type="spellStart"/>
       <w:r>
         <w:rPr>
           <w:i/>
@@ -2148,14 +1402,12 @@
         </w:rPr>
         <w:t>IsAlone</w:t>
       </w:r>
-      <w:proofErr w:type="spellEnd"/>
       <w:r>
         <w:rPr>
           <w:lang w:val="es-CL"/>
         </w:rPr>
         <w:t xml:space="preserve"> (composición familiar); </w:t>
       </w:r>
-      <w:proofErr w:type="spellStart"/>
       <w:r>
         <w:rPr>
           <w:i/>
@@ -2163,14 +1415,12 @@
         </w:rPr>
         <w:t>AgeGroup</w:t>
       </w:r>
-      <w:proofErr w:type="spellEnd"/>
       <w:r>
         <w:rPr>
           <w:lang w:val="es-CL"/>
         </w:rPr>
         <w:t xml:space="preserve"> (rangos etarios demográficamente interpretables); </w:t>
       </w:r>
-      <w:proofErr w:type="spellStart"/>
       <w:r>
         <w:rPr>
           <w:i/>
@@ -2178,14 +1428,19 @@
         </w:rPr>
         <w:t>Fare_log</w:t>
       </w:r>
-      <w:proofErr w:type="spellEnd"/>
-      <w:r>
-        <w:rPr>
-          <w:lang w:val="es-CL"/>
-        </w:rPr>
-        <w:t xml:space="preserve"> = log1p(Fare), que reduce la asimetría de 4.78 a 0.39; </w:t>
-      </w:r>
-      <w:proofErr w:type="spellStart"/>
+      <w:r>
+        <w:rPr>
+          <w:lang w:val="es-CL"/>
+        </w:rPr>
+        <w:t xml:space="preserve"> = log1p(Fare), que reduce la </w:t>
+      </w:r>
+      <w:r>
+        <w:rPr>
+          <w:lang w:val="es-CL"/>
+        </w:rPr>
+        <w:lastRenderedPageBreak/>
+        <w:t xml:space="preserve">asimetría de 4.78 a 0.39; </w:t>
+      </w:r>
       <w:r>
         <w:rPr>
           <w:i/>
@@ -2193,14 +1448,12 @@
         </w:rPr>
         <w:t>FareBand</w:t>
       </w:r>
-      <w:proofErr w:type="spellEnd"/>
       <w:r>
         <w:rPr>
           <w:lang w:val="es-CL"/>
         </w:rPr>
         <w:t xml:space="preserve"> (cuartiles, lectura categórica robusta a la escala); y </w:t>
       </w:r>
-      <w:proofErr w:type="spellStart"/>
       <w:r>
         <w:rPr>
           <w:i/>
@@ -2208,48 +1461,76 @@
         </w:rPr>
         <w:t>Deck_combinado</w:t>
       </w:r>
-      <w:proofErr w:type="spellEnd"/>
-      <w:r>
-        <w:rPr>
-          <w:lang w:val="es-CL"/>
-        </w:rPr>
-        <w:t xml:space="preserve">, que </w:t>
-      </w:r>
-      <w:r>
-        <w:rPr>
-          <w:lang w:val="es-CL"/>
-        </w:rPr>
-        <w:lastRenderedPageBreak/>
-        <w:t xml:space="preserve">aprovecha la integración de la sección IV para maximizar la información de cubierta disponible (aun así, 77.1% permanece "Desconocida"). Las variables nominales se tipificaron como </w:t>
-      </w:r>
-      <w:proofErr w:type="spellStart"/>
+      <w:r>
+        <w:rPr>
+          <w:lang w:val="es-CL"/>
+        </w:rPr>
+        <w:t xml:space="preserve">, que completa </w:t>
+      </w:r>
       <w:r>
         <w:rPr>
           <w:i/>
           <w:lang w:val="es-CL"/>
         </w:rPr>
+        <w:t>Cabin_letra</w:t>
+      </w:r>
+      <w:r>
+        <w:rPr>
+          <w:lang w:val="es-CL"/>
+        </w:rPr>
+        <w:t xml:space="preserve"> con </w:t>
+      </w:r>
+      <w:r>
+        <w:rPr>
+          <w:i/>
+          <w:lang w:val="es-CL"/>
+        </w:rPr>
+        <w:t>deck</w:t>
+      </w:r>
+      <w:r>
+        <w:rPr>
+          <w:lang w:val="es-CL"/>
+        </w:rPr>
+        <w:t xml:space="preserve"> de la fuente integrada; la combinación no agrega ningún registro (</w:t>
+      </w:r>
+      <w:r>
+        <w:rPr>
+          <w:i/>
+          <w:lang w:val="es-CL"/>
+        </w:rPr>
+        <w:t>deck</w:t>
+      </w:r>
+      <w:r>
+        <w:rPr>
+          <w:lang w:val="es-CL"/>
+        </w:rPr>
+        <w:t xml:space="preserve"> es un subconjunto de </w:t>
+      </w:r>
+      <w:r>
+        <w:rPr>
+          <w:i/>
+          <w:lang w:val="es-CL"/>
+        </w:rPr>
+        <w:t>Cabin_letra</w:t>
+      </w:r>
+      <w:r>
+        <w:rPr>
+          <w:lang w:val="es-CL"/>
+        </w:rPr>
+        <w:t xml:space="preserve">), de modo que 77.1% permanece "Desconocida" y la variable queda validada por dos fuentes, no ampliada. Las variables nominales se tipificaron como </w:t>
+      </w:r>
+      <w:r>
+        <w:rPr>
+          <w:i/>
+          <w:lang w:val="es-CL"/>
+        </w:rPr>
         <w:t>category</w:t>
       </w:r>
-      <w:proofErr w:type="spellEnd"/>
-      <w:r>
-        <w:rPr>
-          <w:lang w:val="es-CL"/>
-        </w:rPr>
-        <w:t xml:space="preserve">. El </w:t>
-      </w:r>
-      <w:proofErr w:type="spellStart"/>
-      <w:r>
-        <w:rPr>
-          <w:lang w:val="es-CL"/>
-        </w:rPr>
-        <w:t>dataset</w:t>
-      </w:r>
-      <w:proofErr w:type="spellEnd"/>
-      <w:r>
-        <w:rPr>
-          <w:lang w:val="es-CL"/>
-        </w:rPr>
-        <w:t xml:space="preserve"> preparado se exportó a </w:t>
+      <w:r>
+        <w:rPr>
+          <w:lang w:val="es-CL"/>
+        </w:rPr>
+        <w:t xml:space="preserve">. El dataset preparado se exportó a </w:t>
       </w:r>
       <w:r>
         <w:rPr>
@@ -2262,7 +1543,7 @@
         <w:rPr>
           <w:lang w:val="es-CL"/>
         </w:rPr>
-        <w:t xml:space="preserve"> para trazabilidad.</w:t>
+        <w:t xml:space="preserve"> para trazabilidad (véase notebook, apartado VI).</w:t>
       </w:r>
     </w:p>
     <w:p>
@@ -2279,27 +1560,7 @@
           <w:sz w:val="26"/>
           <w:lang w:val="es-CL"/>
         </w:rPr>
-        <w:t xml:space="preserve">VI. Análisis </w:t>
-      </w:r>
-      <w:proofErr w:type="spellStart"/>
-      <w:r>
-        <w:rPr>
-          <w:b/>
-          <w:color w:val="1A1A2E"/>
-          <w:sz w:val="26"/>
-          <w:lang w:val="es-CL"/>
-        </w:rPr>
-        <w:t>univariado</w:t>
-      </w:r>
-      <w:proofErr w:type="spellEnd"/>
-      <w:r>
-        <w:rPr>
-          <w:b/>
-          <w:color w:val="1A1A2E"/>
-          <w:sz w:val="26"/>
-          <w:lang w:val="es-CL"/>
-        </w:rPr>
-        <w:t xml:space="preserve"> y bivariado desarrollado</w:t>
+        <w:t>VI. Análisis univariado y bivariado desarrollado</w:t>
       </w:r>
     </w:p>
     <w:p>
@@ -2309,136 +1570,135 @@
           <w:lang w:val="es-CL"/>
         </w:rPr>
       </w:pPr>
-      <w:proofErr w:type="spellStart"/>
       <w:r>
         <w:rPr>
           <w:b/>
           <w:lang w:val="es-CL"/>
         </w:rPr>
-        <w:t>Univariado</w:t>
-      </w:r>
-      <w:proofErr w:type="spellEnd"/>
-      <w:r>
-        <w:rPr>
-          <w:b/>
-          <w:lang w:val="es-CL"/>
-        </w:rPr>
-        <w:t>:</w:t>
-      </w:r>
-      <w:r>
-        <w:rPr>
-          <w:lang w:val="es-CL"/>
-        </w:rPr>
-        <w:t xml:space="preserve"> </w:t>
-      </w:r>
-      <w:proofErr w:type="gramStart"/>
-      <w:r>
-        <w:rPr>
-          <w:lang w:val="es-CL"/>
-        </w:rPr>
-        <w:t>el test</w:t>
-      </w:r>
-      <w:proofErr w:type="gramEnd"/>
-      <w:r>
-        <w:rPr>
-          <w:lang w:val="es-CL"/>
-        </w:rPr>
-        <w:t xml:space="preserve"> de normalidad de D'Agostino-Pearson rechaza la normalidad (p&lt;0.05) en </w:t>
+        <w:t>Univariado:</w:t>
+      </w:r>
+      <w:r>
+        <w:rPr>
+          <w:lang w:val="es-CL"/>
+        </w:rPr>
+        <w:t xml:space="preserve"> el test de normalidad de D'Agostino-Pearson rechaza la normalidad (p&lt;0.05) en </w:t>
       </w:r>
       <w:r>
         <w:rPr>
           <w:i/>
           <w:lang w:val="es-CL"/>
         </w:rPr>
-        <w:t xml:space="preserve">Age, Fare, </w:t>
-      </w:r>
-      <w:proofErr w:type="spellStart"/>
+        <w:t>Age, Fare, Fare_log</w:t>
+      </w:r>
+      <w:r>
+        <w:rPr>
+          <w:lang w:val="es-CL"/>
+        </w:rPr>
+        <w:t xml:space="preserve"> y </w:t>
+      </w:r>
       <w:r>
         <w:rPr>
           <w:i/>
           <w:lang w:val="es-CL"/>
         </w:rPr>
-        <w:t>Fare_log</w:t>
-      </w:r>
-      <w:proofErr w:type="spellEnd"/>
-      <w:r>
-        <w:rPr>
-          <w:lang w:val="es-CL"/>
-        </w:rPr>
-        <w:t xml:space="preserve"> y </w:t>
-      </w:r>
-      <w:proofErr w:type="spellStart"/>
+        <w:t>FamilySize</w:t>
+      </w:r>
+      <w:r>
+        <w:rPr>
+          <w:lang w:val="es-CL"/>
+        </w:rPr>
+        <w:t xml:space="preserve">, lo que justificó reportar mediana/IQR como medidas primarias. </w:t>
+      </w:r>
       <w:r>
         <w:rPr>
           <w:i/>
           <w:lang w:val="es-CL"/>
         </w:rPr>
+        <w:t>Survived</w:t>
+      </w:r>
+      <w:r>
+        <w:rPr>
+          <w:lang w:val="es-CL"/>
+        </w:rPr>
+        <w:t xml:space="preserve">: 38.4% de sobrevivientes (342/891); </w:t>
+      </w:r>
+      <w:r>
+        <w:rPr>
+          <w:i/>
+          <w:lang w:val="es-CL"/>
+        </w:rPr>
+        <w:t>Pclass</w:t>
+      </w:r>
+      <w:r>
+        <w:rPr>
+          <w:lang w:val="es-CL"/>
+        </w:rPr>
+        <w:t xml:space="preserve">: 55.1% tercera clase; </w:t>
+      </w:r>
+      <w:r>
+        <w:rPr>
+          <w:i/>
+          <w:lang w:val="es-CL"/>
+        </w:rPr>
+        <w:t>Sex</w:t>
+      </w:r>
+      <w:r>
+        <w:rPr>
+          <w:lang w:val="es-CL"/>
+        </w:rPr>
+        <w:t xml:space="preserve">: 64.8% hombres; </w:t>
+      </w:r>
+      <w:r>
+        <w:rPr>
+          <w:i/>
+          <w:lang w:val="es-CL"/>
+        </w:rPr>
+        <w:t>Embarked</w:t>
+      </w:r>
+      <w:r>
+        <w:rPr>
+          <w:lang w:val="es-CL"/>
+        </w:rPr>
+        <w:t xml:space="preserve">: 72.5% Southampton. Medidas primarias: </w:t>
+      </w:r>
+      <w:r>
+        <w:rPr>
+          <w:i/>
+          <w:lang w:val="es-CL"/>
+        </w:rPr>
+        <w:t>Age_clean</w:t>
+      </w:r>
+      <w:r>
+        <w:rPr>
+          <w:lang w:val="es-CL"/>
+        </w:rPr>
+        <w:t xml:space="preserve"> mediana 26.0 (IQR 14.5), </w:t>
+      </w:r>
+      <w:r>
+        <w:rPr>
+          <w:i/>
+          <w:lang w:val="es-CL"/>
+        </w:rPr>
+        <w:t>Fare</w:t>
+      </w:r>
+      <w:r>
+        <w:rPr>
+          <w:lang w:val="es-CL"/>
+        </w:rPr>
+        <w:t xml:space="preserve"> mediana 14.45 (IQR 23.09), </w:t>
+      </w:r>
+      <w:r>
+        <w:rPr>
+          <w:i/>
+          <w:lang w:val="es-CL"/>
+        </w:rPr>
         <w:t>FamilySize</w:t>
       </w:r>
-      <w:proofErr w:type="spellEnd"/>
-      <w:r>
-        <w:rPr>
-          <w:lang w:val="es-CL"/>
-        </w:rPr>
-        <w:t xml:space="preserve">, lo que justificó reportar mediana/IQR como medidas primarias. </w:t>
-      </w:r>
-      <w:proofErr w:type="spellStart"/>
-      <w:r>
-        <w:rPr>
-          <w:i/>
-          <w:lang w:val="es-CL"/>
-        </w:rPr>
-        <w:t>Survived</w:t>
-      </w:r>
-      <w:proofErr w:type="spellEnd"/>
-      <w:r>
-        <w:rPr>
-          <w:lang w:val="es-CL"/>
-        </w:rPr>
-        <w:t xml:space="preserve">: 38.4% de sobrevivientes (342/891); </w:t>
-      </w:r>
-      <w:proofErr w:type="spellStart"/>
-      <w:r>
-        <w:rPr>
-          <w:i/>
-          <w:lang w:val="es-CL"/>
-        </w:rPr>
-        <w:t>Pclass</w:t>
-      </w:r>
-      <w:proofErr w:type="spellEnd"/>
-      <w:r>
-        <w:rPr>
-          <w:lang w:val="es-CL"/>
-        </w:rPr>
-        <w:t xml:space="preserve">: 55.1% tercera clase; </w:t>
-      </w:r>
-      <w:r>
-        <w:rPr>
-          <w:i/>
-          <w:lang w:val="es-CL"/>
-        </w:rPr>
-        <w:t>Sex</w:t>
-      </w:r>
-      <w:r>
-        <w:rPr>
-          <w:lang w:val="es-CL"/>
-        </w:rPr>
-        <w:t xml:space="preserve">: 64.8% hombres; </w:t>
-      </w:r>
-      <w:proofErr w:type="spellStart"/>
-      <w:r>
-        <w:rPr>
-          <w:i/>
-          <w:lang w:val="es-CL"/>
-        </w:rPr>
-        <w:t>Embarked</w:t>
-      </w:r>
-      <w:proofErr w:type="spellEnd"/>
-      <w:r>
-        <w:rPr>
-          <w:lang w:val="es-CL"/>
-        </w:rPr>
-        <w:t>: 72.5% Southampton.</w:t>
+      <w:r>
+        <w:rPr>
+          <w:lang w:val="es-CL"/>
+        </w:rPr>
+        <w:t xml:space="preserve"> mediana 1 (IQR 1); las distribuciones se examinaron con histogramas con KDE, boxplots y gráficos de frecuencia (véase notebook, apartado VII).</w:t>
       </w:r>
     </w:p>
     <w:p>
@@ -2453,39 +1713,7 @@
           <w:b/>
           <w:lang w:val="es-CL"/>
         </w:rPr>
-        <w:t xml:space="preserve">Bivariado categórico (chi-cuadrado y V de </w:t>
-      </w:r>
-      <w:proofErr w:type="spellStart"/>
-      <w:r>
-        <w:rPr>
-          <w:b/>
-          <w:lang w:val="es-CL"/>
-        </w:rPr>
-        <w:t>Cramér</w:t>
-      </w:r>
-      <w:proofErr w:type="spellEnd"/>
-      <w:r>
-        <w:rPr>
-          <w:b/>
-          <w:lang w:val="es-CL"/>
-        </w:rPr>
-        <w:t xml:space="preserve"> frente a </w:t>
-      </w:r>
-      <w:proofErr w:type="spellStart"/>
-      <w:r>
-        <w:rPr>
-          <w:b/>
-          <w:lang w:val="es-CL"/>
-        </w:rPr>
-        <w:t>Survived</w:t>
-      </w:r>
-      <w:proofErr w:type="spellEnd"/>
-      <w:r>
-        <w:rPr>
-          <w:b/>
-          <w:lang w:val="es-CL"/>
-        </w:rPr>
-        <w:t>)</w:t>
+        <w:t>Bivariado categórico (chi-cuadrado y V de Cramér frente a Survived)</w:t>
       </w:r>
     </w:p>
     <w:tbl>
@@ -3095,39 +2323,7 @@
           <w:sz w:val="19"/>
           <w:lang w:val="es-CL"/>
         </w:rPr>
-        <w:t xml:space="preserve">*Lectura de efecto según convención de Cohen (1988); los umbrales dependen de los grados de libertad (1 a 8 según la variable), por lo que la comparación directa entre variables es orientativa, no una escala única. </w:t>
-      </w:r>
-      <w:proofErr w:type="spellStart"/>
-      <w:r>
-        <w:rPr>
-          <w:sz w:val="19"/>
-          <w:lang w:val="es-CL"/>
-        </w:rPr>
-        <w:t>Título_agrupado</w:t>
-      </w:r>
-      <w:proofErr w:type="spellEnd"/>
-      <w:r>
-        <w:rPr>
-          <w:sz w:val="19"/>
-          <w:lang w:val="es-CL"/>
-        </w:rPr>
-        <w:t xml:space="preserve"> (16.7% de celdas con frecuencia esperada &lt;5) permanece dentro del umbral habitual de tolerancia (regla de Cochran: máx. 20%); </w:t>
-      </w:r>
-      <w:proofErr w:type="spellStart"/>
-      <w:r>
-        <w:rPr>
-          <w:sz w:val="19"/>
-          <w:lang w:val="es-CL"/>
-        </w:rPr>
-        <w:t>Deck_combinado</w:t>
-      </w:r>
-      <w:proofErr w:type="spellEnd"/>
-      <w:r>
-        <w:rPr>
-          <w:sz w:val="19"/>
-          <w:lang w:val="es-CL"/>
-        </w:rPr>
-        <w:t xml:space="preserve"> (27.8%) lo excede, por lo que su p-valor y su V deben interpretarse con mayor cautela.</w:t>
+        <w:t>*Lectura de efecto según la convención de Cohen (1988) para V de Cramér (0.10 / 0.30 / 0.50). Como Survived es binaria, min(r−1, c−1) = 1 en todas las tablas, por lo que los umbrales son los mismos para todas las variables y sus V son comparables en escala, aunque los grados de libertad del χ² varíen entre 1 y 8; la confiabilidad de cada V depende además de las frecuencias esperadas: Title_agrupado (16.7% de celdas con frecuencia esperada &lt;5) permanece dentro del umbral habitual de tolerancia (regla de Cochran: máx. 20%); Deck_combinado (27.8%) lo excede, por lo que su p-valor y su V deben interpretarse con mayor cautela.</w:t>
       </w:r>
     </w:p>
     <w:p>
@@ -3142,148 +2338,117 @@
           <w:b/>
           <w:lang w:val="es-CL"/>
         </w:rPr>
-        <w:t xml:space="preserve">Bivariado numérico (Mann-Whitney U frente a </w:t>
-      </w:r>
-      <w:proofErr w:type="spellStart"/>
+        <w:t>Bivariado numérico (Mann-Whitney U frente a Survived, dada la no normalidad):</w:t>
+      </w:r>
+      <w:r>
+        <w:rPr>
+          <w:lang w:val="es-CL"/>
+        </w:rPr>
+        <w:t xml:space="preserve"> </w:t>
+      </w:r>
+      <w:r>
+        <w:rPr>
+          <w:i/>
+          <w:lang w:val="es-CL"/>
+        </w:rPr>
+        <w:t>Fare</w:t>
+      </w:r>
+      <w:r>
+        <w:rPr>
+          <w:lang w:val="es-CL"/>
+        </w:rPr>
+        <w:t xml:space="preserve"> difiere significativamente (mediana 26.0 vs. 10.5; p&lt;0.001; r≈0.38, efecto moderado); </w:t>
+      </w:r>
+      <w:r>
+        <w:rPr>
+          <w:i/>
+          <w:lang w:val="es-CL"/>
+        </w:rPr>
+        <w:t>FamilySize</w:t>
+      </w:r>
+      <w:r>
+        <w:rPr>
+          <w:lang w:val="es-CL"/>
+        </w:rPr>
+        <w:t xml:space="preserve"> también difiere (mediana 2 vs. 1; p&lt;0.001; r≈0.17, efecto pequeño); </w:t>
+      </w:r>
+      <w:r>
+        <w:rPr>
+          <w:i/>
+          <w:lang w:val="es-CL"/>
+        </w:rPr>
+        <w:t>Age_clean</w:t>
+      </w:r>
+      <w:r>
+        <w:rPr>
+          <w:lang w:val="es-CL"/>
+        </w:rPr>
+        <w:t xml:space="preserve"> </w:t>
+      </w:r>
       <w:r>
         <w:rPr>
           <w:b/>
           <w:lang w:val="es-CL"/>
         </w:rPr>
+        <w:t>no</w:t>
+      </w:r>
+      <w:r>
+        <w:rPr>
+          <w:lang w:val="es-CL"/>
+        </w:rPr>
+        <w:t xml:space="preserve"> muestra diferencia significativa (p≈0.25; r≈−0.05). La correlación de Spearman entre </w:t>
+      </w:r>
+      <w:r>
+        <w:rPr>
+          <w:i/>
+          <w:lang w:val="es-CL"/>
+        </w:rPr>
         <w:t>Survived</w:t>
       </w:r>
-      <w:proofErr w:type="spellEnd"/>
+      <w:r>
+        <w:rPr>
+          <w:lang w:val="es-CL"/>
+        </w:rPr>
+        <w:t xml:space="preserve"> y </w:t>
+      </w:r>
+      <w:r>
+        <w:rPr>
+          <w:i/>
+          <w:lang w:val="es-CL"/>
+        </w:rPr>
+        <w:t>Fare</w:t>
+      </w:r>
+      <w:r>
+        <w:rPr>
+          <w:lang w:val="es-CL"/>
+        </w:rPr>
+        <w:t xml:space="preserve"> (0.32) es notoriamente mayor que la de Pearson (0.26), reflejo de la asimetría de </w:t>
+      </w:r>
+      <w:r>
+        <w:rPr>
+          <w:i/>
+          <w:lang w:val="es-CL"/>
+        </w:rPr>
+        <w:t>Fare</w:t>
+      </w:r>
+      <w:r>
+        <w:rPr>
+          <w:lang w:val="es-CL"/>
+        </w:rPr>
+        <w:t xml:space="preserve">. El hallazgo más relevante es la </w:t>
+      </w:r>
       <w:r>
         <w:rPr>
           <w:b/>
           <w:lang w:val="es-CL"/>
         </w:rPr>
-        <w:t>, dada la no normalidad):</w:t>
-      </w:r>
-      <w:r>
-        <w:rPr>
-          <w:lang w:val="es-CL"/>
-        </w:rPr>
-        <w:t xml:space="preserve"> </w:t>
-      </w:r>
-      <w:r>
-        <w:rPr>
-          <w:i/>
-          <w:lang w:val="es-CL"/>
-        </w:rPr>
-        <w:t>Fare</w:t>
-      </w:r>
-      <w:r>
-        <w:rPr>
-          <w:lang w:val="es-CL"/>
-        </w:rPr>
-        <w:t xml:space="preserve"> difiere significativamente (mediana 26.0 vs. 10.5; p&lt;0.001; r≈0.38, efecto moderado); </w:t>
-      </w:r>
-      <w:proofErr w:type="spellStart"/>
-      <w:r>
-        <w:rPr>
-          <w:i/>
-          <w:lang w:val="es-CL"/>
-        </w:rPr>
-        <w:t>FamilySize</w:t>
-      </w:r>
-      <w:proofErr w:type="spellEnd"/>
-      <w:r>
-        <w:rPr>
-          <w:lang w:val="es-CL"/>
-        </w:rPr>
-        <w:t xml:space="preserve"> también difiere (mediana 2 vs. 1; p&lt;0.001; r≈0.17, efecto pequeño); </w:t>
-      </w:r>
-      <w:proofErr w:type="spellStart"/>
-      <w:r>
-        <w:rPr>
-          <w:i/>
-          <w:lang w:val="es-CL"/>
-        </w:rPr>
-        <w:t>Age_clean</w:t>
-      </w:r>
-      <w:proofErr w:type="spellEnd"/>
-      <w:r>
-        <w:rPr>
-          <w:lang w:val="es-CL"/>
-        </w:rPr>
-        <w:t xml:space="preserve"> </w:t>
-      </w:r>
-      <w:r>
-        <w:rPr>
-          <w:b/>
-          <w:lang w:val="es-CL"/>
-        </w:rPr>
-        <w:t>no</w:t>
-      </w:r>
-      <w:r>
-        <w:rPr>
-          <w:lang w:val="es-CL"/>
-        </w:rPr>
-        <w:t xml:space="preserve"> muestra diferencia significativa (p≈0.25; r≈−0.05). La correlación de Spearman entre </w:t>
-      </w:r>
-      <w:proofErr w:type="spellStart"/>
-      <w:r>
-        <w:rPr>
-          <w:i/>
-          <w:lang w:val="es-CL"/>
-        </w:rPr>
-        <w:t>Survived</w:t>
-      </w:r>
-      <w:proofErr w:type="spellEnd"/>
-      <w:r>
-        <w:rPr>
-          <w:lang w:val="es-CL"/>
-        </w:rPr>
-        <w:t xml:space="preserve"> y </w:t>
-      </w:r>
-      <w:r>
-        <w:rPr>
-          <w:i/>
-          <w:lang w:val="es-CL"/>
-        </w:rPr>
-        <w:t>Fare</w:t>
-      </w:r>
-      <w:r>
-        <w:rPr>
-          <w:lang w:val="es-CL"/>
-        </w:rPr>
-        <w:t xml:space="preserve"> (0.32) es notoriamente mayor que la de Pearson (0.26), reflejo de la asimetría de </w:t>
-      </w:r>
-      <w:r>
-        <w:rPr>
-          <w:i/>
-          <w:lang w:val="es-CL"/>
-        </w:rPr>
-        <w:t>Fare</w:t>
-      </w:r>
-      <w:r>
-        <w:rPr>
-          <w:lang w:val="es-CL"/>
-        </w:rPr>
-        <w:t xml:space="preserve">. El hallazgo más relevante es la </w:t>
-      </w:r>
-      <w:r>
-        <w:rPr>
-          <w:b/>
-          <w:lang w:val="es-CL"/>
-        </w:rPr>
-        <w:t xml:space="preserve">interacción Sex × </w:t>
-      </w:r>
-      <w:proofErr w:type="spellStart"/>
-      <w:r>
-        <w:rPr>
-          <w:b/>
-          <w:lang w:val="es-CL"/>
-        </w:rPr>
-        <w:t>Pclass</w:t>
-      </w:r>
-      <w:proofErr w:type="spellEnd"/>
-      <w:r>
-        <w:rPr>
-          <w:lang w:val="es-CL"/>
-        </w:rPr>
-        <w:t>: la supervivencia femenina se mantiene alta en todas las clases (96.8% en 1ª, 92.1% en 2ª, 50.0% en 3ª), mientras que la masculina cae abruptamente (36.9%, 15.7%, 13.5%), matizando la heurística histórica de "mujeres y niños primero".</w:t>
+        <w:t>interacción Sex × Pclass</w:t>
+      </w:r>
+      <w:r>
+        <w:rPr>
+          <w:lang w:val="es-CL"/>
+        </w:rPr>
+        <w:t>: la supervivencia femenina se mantiene alta en todas las clases (96.8% en 1ª, 92.1% en 2ª, 50.0% en 3ª), mientras que la masculina cae abruptamente (36.9%, 15.7%, 13.5%), matizando la heurística histórica de "mujeres y niños primero". Las relaciones se visualizaron con gráficos de tasas por categoría, violin plots, mapas de calor de correlación y un gráfico de interacción (véase notebook, apartados VIII.1 a VIII.3).</w:t>
       </w:r>
     </w:p>
     <w:p>
@@ -3314,21 +2479,7 @@
         <w:rPr>
           <w:lang w:val="es-CL"/>
         </w:rPr>
-        <w:t xml:space="preserve">La detección de </w:t>
-      </w:r>
-      <w:proofErr w:type="spellStart"/>
-      <w:r>
-        <w:rPr>
-          <w:lang w:val="es-CL"/>
-        </w:rPr>
-        <w:t>outliers</w:t>
-      </w:r>
-      <w:proofErr w:type="spellEnd"/>
-      <w:r>
-        <w:rPr>
-          <w:lang w:val="es-CL"/>
-        </w:rPr>
-        <w:t xml:space="preserve"> (IQR y Z-score robusto/MAD, del mismo orden de magnitud entre sí) identificó 116 casos atípicos en </w:t>
+        <w:t xml:space="preserve">La detección de outliers identificó, mediante IQR, 116 casos atípicos en </w:t>
       </w:r>
       <w:r>
         <w:rPr>
@@ -3341,9 +2492,8 @@
         <w:rPr>
           <w:lang w:val="es-CL"/>
         </w:rPr>
-        <w:t xml:space="preserve"> (13.0%) y 33 en </w:t>
-      </w:r>
-      <w:proofErr w:type="spellStart"/>
+        <w:t xml:space="preserve"> (13.0%; el Z-score robusto/MAD entrega una proporción del mismo orden, 18.0%) y 33 en </w:t>
+      </w:r>
       <w:r>
         <w:rPr>
           <w:i/>
@@ -3351,26 +2501,18 @@
         </w:rPr>
         <w:t>Age_clean</w:t>
       </w:r>
-      <w:proofErr w:type="spellEnd"/>
-      <w:r>
-        <w:rPr>
-          <w:lang w:val="es-CL"/>
-        </w:rPr>
-        <w:t xml:space="preserve"> (3.7%; estos últimos concentrados en su totalidad por encima de 57.75 años, sin ningún caso en el extremo bajo). El 90% de los </w:t>
-      </w:r>
-      <w:proofErr w:type="spellStart"/>
-      <w:r>
-        <w:rPr>
-          <w:lang w:val="es-CL"/>
-        </w:rPr>
-        <w:t>outliers</w:t>
-      </w:r>
-      <w:proofErr w:type="spellEnd"/>
-      <w:r>
-        <w:rPr>
-          <w:lang w:val="es-CL"/>
-        </w:rPr>
-        <w:t xml:space="preserve"> de </w:t>
+      <w:r>
+        <w:rPr>
+          <w:lang w:val="es-CL"/>
+        </w:rPr>
+        <w:t xml:space="preserve"> (3.7% por IQR frente a 1.7% por MAD, discrepancia atribuible a la mayor sensibilidad de IQR ante una cola larga acotada; concentrados en su </w:t>
+      </w:r>
+      <w:r>
+        <w:rPr>
+          <w:lang w:val="es-CL"/>
+        </w:rPr>
+        <w:lastRenderedPageBreak/>
+        <w:t xml:space="preserve">totalidad por encima de 57.75 años, sin ningún caso en el extremo bajo). El 90% de los outliers de </w:t>
       </w:r>
       <w:r>
         <w:rPr>
@@ -3385,7 +2527,6 @@
         </w:rPr>
         <w:t xml:space="preserve"> corresponde a primera clase y el 92.2% comparte número de </w:t>
       </w:r>
-      <w:proofErr w:type="gramStart"/>
       <w:r>
         <w:rPr>
           <w:i/>
@@ -3393,7 +2534,6 @@
         </w:rPr>
         <w:t>Ticket</w:t>
       </w:r>
-      <w:proofErr w:type="gramEnd"/>
       <w:r>
         <w:rPr>
           <w:lang w:val="es-CL"/>
@@ -3424,23 +2564,8 @@
         <w:rPr>
           <w:lang w:val="es-CL"/>
         </w:rPr>
-        <w:t>=0 son, sin excepción, hombres embarcados en Southampton (14/15 con título "</w:t>
-      </w:r>
-      <w:proofErr w:type="spellStart"/>
-      <w:r>
-        <w:rPr>
-          <w:lang w:val="es-CL"/>
-        </w:rPr>
-        <w:t>Mr</w:t>
-      </w:r>
-      <w:proofErr w:type="spellEnd"/>
-      <w:r>
-        <w:rPr>
-          <w:lang w:val="es-CL"/>
-        </w:rPr>
-        <w:t xml:space="preserve">"), varios con números de </w:t>
-      </w:r>
-      <w:proofErr w:type="gramStart"/>
+        <w:t xml:space="preserve">=0 son, sin excepción, hombres embarcados en Southampton (14/15 con título "Mr"), varios con números de </w:t>
+      </w:r>
       <w:r>
         <w:rPr>
           <w:i/>
@@ -3448,14 +2573,12 @@
         </w:rPr>
         <w:t>Ticket</w:t>
       </w:r>
-      <w:proofErr w:type="gramEnd"/>
       <w:r>
         <w:rPr>
           <w:lang w:val="es-CL"/>
         </w:rPr>
         <w:t xml:space="preserve"> compartidos o atípicos (p. ej., 4 casos con </w:t>
       </w:r>
-      <w:proofErr w:type="gramStart"/>
       <w:r>
         <w:rPr>
           <w:i/>
@@ -3463,19 +2586,11 @@
         </w:rPr>
         <w:t>Ticket</w:t>
       </w:r>
-      <w:proofErr w:type="gramEnd"/>
-      <w:r>
-        <w:rPr>
-          <w:lang w:val="es-CL"/>
-        </w:rPr>
-        <w:t xml:space="preserve">="LINE"); el patrón es consistente con empleados de la </w:t>
-      </w:r>
-      <w:r>
-        <w:rPr>
-          <w:lang w:val="es-CL"/>
-        </w:rPr>
-        <w:lastRenderedPageBreak/>
-        <w:t>naviera registrados como pasajeros, hipótesis razonable pero no verificable de forma concluyente con los campos disponibles.</w:t>
+      <w:r>
+        <w:rPr>
+          <w:lang w:val="es-CL"/>
+        </w:rPr>
+        <w:t>="LINE"); el patrón es consistente con empleados de la naviera registrados como pasajeros, hipótesis razonable pero no verificable de forma concluyente con los campos disponibles (véase notebook, apartado IX).</w:t>
       </w:r>
     </w:p>
     <w:p>
@@ -3524,35 +2639,7 @@
         <w:rPr>
           <w:lang w:val="es-CL"/>
         </w:rPr>
-        <w:t>Se asume que la ausencia de Cabin/</w:t>
-      </w:r>
-      <w:proofErr w:type="spellStart"/>
-      <w:r>
-        <w:rPr>
-          <w:lang w:val="es-CL"/>
-        </w:rPr>
-        <w:t>deck</w:t>
-      </w:r>
-      <w:proofErr w:type="spellEnd"/>
-      <w:r>
-        <w:rPr>
-          <w:lang w:val="es-CL"/>
-        </w:rPr>
-        <w:t xml:space="preserve"> es MAR (asociada a </w:t>
-      </w:r>
-      <w:proofErr w:type="spellStart"/>
-      <w:r>
-        <w:rPr>
-          <w:lang w:val="es-CL"/>
-        </w:rPr>
-        <w:t>Pclass</w:t>
-      </w:r>
-      <w:proofErr w:type="spellEnd"/>
-      <w:r>
-        <w:rPr>
-          <w:lang w:val="es-CL"/>
-        </w:rPr>
-        <w:t>) y no completamente al azar, con base en evidencia cruzada, sin poder descartar formalmente otros mecanismos.</w:t>
+        <w:t>Se asume que la ausencia de Cabin/deck es MAR (asociada a Pclass) y no completamente al azar, con base en evidencia cruzada, sin poder descartar formalmente otros mecanismos.</w:t>
       </w:r>
     </w:p>
     <w:p>
@@ -3568,35 +2655,7 @@
         <w:rPr>
           <w:lang w:val="es-CL"/>
         </w:rPr>
-        <w:t xml:space="preserve">Las pruebas chi-cuadrado de </w:t>
-      </w:r>
-      <w:proofErr w:type="spellStart"/>
-      <w:r>
-        <w:rPr>
-          <w:lang w:val="es-CL"/>
-        </w:rPr>
-        <w:t>Title_agrupado</w:t>
-      </w:r>
-      <w:proofErr w:type="spellEnd"/>
-      <w:r>
-        <w:rPr>
-          <w:lang w:val="es-CL"/>
-        </w:rPr>
-        <w:t xml:space="preserve"> y </w:t>
-      </w:r>
-      <w:proofErr w:type="spellStart"/>
-      <w:r>
-        <w:rPr>
-          <w:lang w:val="es-CL"/>
-        </w:rPr>
-        <w:t>Deck_combinado</w:t>
-      </w:r>
-      <w:proofErr w:type="spellEnd"/>
-      <w:r>
-        <w:rPr>
-          <w:lang w:val="es-CL"/>
-        </w:rPr>
-        <w:t xml:space="preserve"> tienen categorías poco pobladas (celdas esperadas &lt;5), lo que reduce la confiabilidad formal de esos p-valores específicos.</w:t>
+        <w:t>Las pruebas chi-cuadrado de Title_agrupado y Deck_combinado tienen categorías poco pobladas (celdas esperadas &lt;5), lo que reduce la confiabilidad formal de esos p-valores específicos.</w:t>
       </w:r>
     </w:p>
     <w:p>
@@ -3612,21 +2671,7 @@
         <w:rPr>
           <w:lang w:val="es-CL"/>
         </w:rPr>
-        <w:t xml:space="preserve">La imputación de Age y el indicador </w:t>
-      </w:r>
-      <w:proofErr w:type="spellStart"/>
-      <w:r>
-        <w:rPr>
-          <w:lang w:val="es-CL"/>
-        </w:rPr>
-        <w:t>Cabin_registrada</w:t>
-      </w:r>
-      <w:proofErr w:type="spellEnd"/>
-      <w:r>
-        <w:rPr>
-          <w:lang w:val="es-CL"/>
-        </w:rPr>
-        <w:t xml:space="preserve"> implican riesgo de fuga de información si se reutilizan sin recalcular sobre el set de entrenamiento en una fase de modelado futura.</w:t>
+        <w:t>La imputación de Age y el indicador Cabin_registrada implican riesgo de fuga de información si se reutilizan sin recalcular sobre el set de entrenamiento en una fase de modelado futura.</w:t>
       </w:r>
     </w:p>
     <w:p>
@@ -3642,21 +2687,7 @@
         <w:rPr>
           <w:lang w:val="es-CL"/>
         </w:rPr>
-        <w:t xml:space="preserve">El análisis es exploratorio y descriptivo: las asociaciones reportadas, incluida la interacción Sex × </w:t>
-      </w:r>
-      <w:proofErr w:type="spellStart"/>
-      <w:r>
-        <w:rPr>
-          <w:lang w:val="es-CL"/>
-        </w:rPr>
-        <w:t>Pclass</w:t>
-      </w:r>
-      <w:proofErr w:type="spellEnd"/>
-      <w:r>
-        <w:rPr>
-          <w:lang w:val="es-CL"/>
-        </w:rPr>
-        <w:t>, no deben interpretarse como relaciones causales.</w:t>
+        <w:t>El análisis es exploratorio y descriptivo: las asociaciones reportadas, incluida la interacción Sex × Pclass, no deben interpretarse como relaciones causales (véase notebook, apartados X y XI).</w:t>
       </w:r>
     </w:p>
     <w:p>
@@ -3796,39 +2827,7 @@
           <w:sz w:val="19"/>
           <w:lang w:val="es-CL"/>
         </w:rPr>
-        <w:t xml:space="preserve">The pandas </w:t>
-      </w:r>
-      <w:proofErr w:type="spellStart"/>
-      <w:r>
-        <w:rPr>
-          <w:sz w:val="19"/>
-          <w:lang w:val="es-CL"/>
-        </w:rPr>
-        <w:t>development</w:t>
-      </w:r>
-      <w:proofErr w:type="spellEnd"/>
-      <w:r>
-        <w:rPr>
-          <w:sz w:val="19"/>
-          <w:lang w:val="es-CL"/>
-        </w:rPr>
-        <w:t xml:space="preserve"> </w:t>
-      </w:r>
-      <w:proofErr w:type="spellStart"/>
-      <w:r>
-        <w:rPr>
-          <w:sz w:val="19"/>
-          <w:lang w:val="es-CL"/>
-        </w:rPr>
-        <w:t>team</w:t>
-      </w:r>
-      <w:proofErr w:type="spellEnd"/>
-      <w:r>
-        <w:rPr>
-          <w:sz w:val="19"/>
-          <w:lang w:val="es-CL"/>
-        </w:rPr>
-        <w:t xml:space="preserve">. (2026). </w:t>
+        <w:t xml:space="preserve">The pandas development team. (2026). </w:t>
       </w:r>
       <w:r>
         <w:rPr>
@@ -3836,18 +2835,8 @@
           <w:sz w:val="19"/>
           <w:lang w:val="es-CL"/>
         </w:rPr>
-        <w:t xml:space="preserve">pandas </w:t>
-      </w:r>
-      <w:proofErr w:type="spellStart"/>
-      <w:r>
-        <w:rPr>
-          <w:i/>
-          <w:sz w:val="19"/>
-          <w:lang w:val="es-CL"/>
-        </w:rPr>
-        <w:t>documentation</w:t>
-      </w:r>
-      <w:proofErr w:type="spellEnd"/>
+        <w:t>pandas documentation</w:t>
+      </w:r>
       <w:r>
         <w:rPr>
           <w:sz w:val="19"/>
@@ -3920,23 +2909,13 @@
         </w:rPr>
         <w:t xml:space="preserve">Waskom, M. L. (s. f.). </w:t>
       </w:r>
-      <w:proofErr w:type="spellStart"/>
       <w:r>
         <w:rPr>
           <w:i/>
           <w:sz w:val="19"/>
           <w:lang w:val="es-CL"/>
         </w:rPr>
-        <w:t>seaborn</w:t>
-      </w:r>
-      <w:proofErr w:type="spellEnd"/>
-      <w:r>
-        <w:rPr>
-          <w:i/>
-          <w:sz w:val="19"/>
-          <w:lang w:val="es-CL"/>
-        </w:rPr>
-        <w:t>-data</w:t>
+        <w:t>seaborn-data</w:t>
       </w:r>
       <w:r>
         <w:rPr>
@@ -3989,7 +2968,7 @@
 </file>
 
 <file path=word/numbering.xml><?xml version="1.0" encoding="utf-8"?>
-<w:numbering xmlns:wpc="http://schemas.microsoft.com/office/word/2010/wordprocessingCanvas" xmlns:cx="http://schemas.microsoft.com/office/drawing/2014/chartex" xmlns:cx1="http://schemas.microsoft.com/office/drawing/2015/9/8/chartex" xmlns:cx2="http://schemas.microsoft.com/office/drawing/2015/10/21/chartex" xmlns:cx3="http://schemas.microsoft.com/office/drawing/2016/5/9/chartex" xmlns:cx4="http://schemas.microsoft.com/office/drawing/2016/5/10/chartex" xmlns:cx5="http://schemas.microsoft.com/office/drawing/2016/5/11/chartex" xmlns:cx6="http://schemas.microsoft.com/office/drawing/2016/5/12/chartex" xmlns:cx7="http://schemas.microsoft.com/office/drawing/2016/5/13/chartex" xmlns:cx8="http://schemas.microsoft.com/office/drawing/2016/5/14/chartex" xmlns:mc="http://schemas.openxmlformats.org/markup-compatibility/2006" xmlns:aink="http://schemas.microsoft.com/office/drawing/2016/ink" xmlns:am3d="http://schemas.microsoft.com/office/drawing/2017/model3d" xmlns:o="urn:schemas-microsoft-com:office:office" xmlns:oel="http://schemas.microsoft.com/office/2019/extlst" xmlns:r="http://schemas.openxmlformats.org/officeDocument/2006/relationships" xmlns:m="http://schemas.openxmlformats.org/officeDocument/2006/math" xmlns:v="urn:schemas-microsoft-com:vml" xmlns:wp14="http://schemas.microsoft.com/office/word/2010/wordprocessingDrawing" xmlns:wp="http://schemas.openxmlformats.org/drawingml/2006/wordprocessingDrawing" xmlns:w10="urn:schemas-microsoft-com:office:word" xmlns:w="http://schemas.openxmlformats.org/wordprocessingml/2006/main" xmlns:w14="http://schemas.microsoft.com/office/word/2010/wordml" xmlns:w15="http://schemas.microsoft.com/office/word/2012/wordml" xmlns:w16cex="http://schemas.microsoft.com/office/word/2018/wordml/cex" xmlns:w16cid="http://schemas.microsoft.com/office/word/2016/wordml/cid" xmlns:w16="http://schemas.microsoft.com/office/word/2018/wordml" xmlns:w16du="http://schemas.microsoft.com/office/word/2023/wordml/word16du" xmlns:w16sdtdh="http://schemas.microsoft.com/office/word/2020/wordml/sdtdatahash" xmlns:w16sdtfl="http://schemas.microsoft.com/office/word/2024/wordml/sdtformatlock" xmlns:w16se="http://schemas.microsoft.com/office/word/2015/wordml/symex" xmlns:wpg="http://schemas.microsoft.com/office/word/2010/wordprocessingGroup" xmlns:wpi="http://schemas.microsoft.com/office/word/2010/wordprocessingInk" xmlns:wne="http://schemas.microsoft.com/office/word/2006/wordml" xmlns:wps="http://schemas.microsoft.com/office/word/2010/wordprocessingShape" mc:Ignorable="w14 w15 w16se w16cid w16 w16cex w16sdtdh w16sdtfl w16du wp14">
+<w:numbering xmlns:wpc="http://schemas.microsoft.com/office/word/2010/wordprocessingCanvas" xmlns:cx="http://schemas.microsoft.com/office/drawing/2014/chartex" xmlns:cx1="http://schemas.microsoft.com/office/drawing/2015/9/8/chartex" xmlns:cx2="http://schemas.microsoft.com/office/drawing/2015/10/21/chartex" xmlns:cx3="http://schemas.microsoft.com/office/drawing/2016/5/9/chartex" xmlns:cx4="http://schemas.microsoft.com/office/drawing/2016/5/10/chartex" xmlns:cx5="http://schemas.microsoft.com/office/drawing/2016/5/11/chartex" xmlns:cx6="http://schemas.microsoft.com/office/drawing/2016/5/12/chartex" xmlns:cx7="http://schemas.microsoft.com/office/drawing/2016/5/13/chartex" xmlns:cx8="http://schemas.microsoft.com/office/drawing/2016/5/14/chartex" xmlns:mc="http://schemas.openxmlformats.org/markup-compatibility/2006" xmlns:aink="http://schemas.microsoft.com/office/drawing/2016/ink" xmlns:am3d="http://schemas.microsoft.com/office/drawing/2017/model3d" xmlns:o="urn:schemas-microsoft-com:office:office" xmlns:oel="http://schemas.microsoft.com/office/2019/extlst" xmlns:r="http://schemas.openxmlformats.org/officeDocument/2006/relationships" xmlns:m="http://schemas.openxmlformats.org/officeDocument/2006/math" xmlns:v="urn:schemas-microsoft-com:vml" xmlns:wp14="http://schemas.microsoft.com/office/word/2010/wordprocessingDrawing" xmlns:wp="http://schemas.openxmlformats.org/drawingml/2006/wordprocessingDrawing" xmlns:w10="urn:schemas-microsoft-com:office:word" xmlns:w="http://schemas.openxmlformats.org/wordprocessingml/2006/main" xmlns:w14="http://schemas.microsoft.com/office/word/2010/wordml" xmlns:w15="http://schemas.microsoft.com/office/word/2012/wordml" xmlns:w16cei="http://schemas.microsoft.com/office/word/2026/wordml/cei" xmlns:w16cex="http://schemas.microsoft.com/office/word/2018/wordml/cex" xmlns:w16cid="http://schemas.microsoft.com/office/word/2016/wordml/cid" xmlns:w16="http://schemas.microsoft.com/office/word/2018/wordml" xmlns:w16du="http://schemas.microsoft.com/office/word/2023/wordml/word16du" xmlns:w16sdtdh="http://schemas.microsoft.com/office/word/2020/wordml/sdtdatahash" xmlns:w16sdtfl="http://schemas.microsoft.com/office/word/2024/wordml/sdtformatlock" xmlns:w16se="http://schemas.microsoft.com/office/word/2015/wordml/symex" xmlns:wpg="http://schemas.microsoft.com/office/word/2010/wordprocessingGroup" xmlns:wpi="http://schemas.microsoft.com/office/word/2010/wordprocessingInk" xmlns:wne="http://schemas.microsoft.com/office/word/2006/wordml" xmlns:wps="http://schemas.microsoft.com/office/word/2010/wordprocessingShape" mc:Ignorable="w14 w15 w16se w16cid w16 w16cex w16sdtdh w16sdtfl w16du wp14">
   <w:abstractNum w:abstractNumId="0" w15:restartNumberingAfterBreak="0">
     <w:nsid w:val="FFFFFF7C"/>
     <w:multiLevelType w:val="singleLevel"/>

</xml_diff>